<commit_message>
fix: Refactor document generation to support multiple shifts and improve template handling
</commit_message>
<xml_diff>
--- a/storage/app/templates/driver-worker-timesheet.docx
+++ b/storage/app/templates/driver-worker-timesheet.docx
@@ -365,31 +365,7 @@
                 <w:szCs w:val="24"/>
                 <w:lang w:bidi="ar-EG"/>
               </w:rPr>
-              <w:t>${</w:t>
-            </w:r>
-            <w:proofErr w:type="spellStart"/>
-            <w:r>
-              <w:rPr>
-                <w:rFonts w:asciiTheme="majorHAnsi" w:eastAsia="Calibri" w:hAnsiTheme="majorHAnsi"/>
-                <w:b/>
-                <w:bCs/>
-                <w:sz w:val="24"/>
-                <w:szCs w:val="24"/>
-                <w:lang w:bidi="ar-EG"/>
-              </w:rPr>
-              <w:t>worker_name</w:t>
-            </w:r>
-            <w:proofErr w:type="spellEnd"/>
-            <w:r>
-              <w:rPr>
-                <w:rFonts w:asciiTheme="majorHAnsi" w:eastAsia="Calibri" w:hAnsiTheme="majorHAnsi"/>
-                <w:b/>
-                <w:bCs/>
-                <w:sz w:val="24"/>
-                <w:szCs w:val="24"/>
-                <w:lang w:bidi="ar-EG"/>
-              </w:rPr>
-              <w:t>}</w:t>
+              <w:t>${worker_name}</w:t>
             </w:r>
           </w:p>
         </w:tc>
@@ -414,19 +390,8 @@
                 <w:szCs w:val="28"/>
                 <w:rtl/>
               </w:rPr>
-              <w:t xml:space="preserve">وقت </w:t>
-            </w:r>
-            <w:proofErr w:type="gramStart"/>
-            <w:r>
-              <w:rPr>
-                <w:rFonts w:asciiTheme="majorHAnsi" w:hAnsiTheme="majorHAnsi" w:hint="cs"/>
-                <w:sz w:val="28"/>
-                <w:szCs w:val="28"/>
-                <w:rtl/>
-              </w:rPr>
-              <w:t>الشيفت :</w:t>
-            </w:r>
-            <w:proofErr w:type="gramEnd"/>
+              <w:t>وقت الشيفت :</w:t>
+            </w:r>
           </w:p>
         </w:tc>
         <w:tc>
@@ -447,14 +412,13 @@
             </w:pPr>
             <w:r>
               <w:rPr>
-                <w:rFonts w:asciiTheme="majorHAnsi" w:hAnsiTheme="majorHAnsi" w:hint="cs"/>
-                <w:b/>
-                <w:bCs/>
-                <w:sz w:val="32"/>
-                <w:szCs w:val="32"/>
-                <w:rtl/>
-              </w:rPr>
-              <w:t>صباحي</w:t>
+                <w:rFonts w:asciiTheme="majorHAnsi" w:hAnsiTheme="majorHAnsi"/>
+                <w:b/>
+                <w:bCs/>
+                <w:sz w:val="32"/>
+                <w:szCs w:val="32"/>
+              </w:rPr>
+              <w:t>${shift}</w:t>
             </w:r>
           </w:p>
         </w:tc>
@@ -545,7 +509,6 @@
               </w:rPr>
               <w:t>${</w:t>
             </w:r>
-            <w:proofErr w:type="spellStart"/>
             <w:r>
               <w:rPr>
                 <w:rFonts w:asciiTheme="majorHAnsi" w:eastAsia="Calibri" w:hAnsiTheme="majorHAnsi" w:cs="Arial"/>
@@ -576,7 +539,6 @@
               </w:rPr>
               <w:t>model</w:t>
             </w:r>
-            <w:proofErr w:type="spellEnd"/>
             <w:r>
               <w:rPr>
                 <w:rFonts w:asciiTheme="majorHAnsi" w:eastAsia="Calibri" w:hAnsiTheme="majorHAnsi" w:cs="Arial"/>
@@ -650,7 +612,6 @@
               </w:rPr>
               <w:t>${</w:t>
             </w:r>
-            <w:proofErr w:type="spellStart"/>
             <w:r>
               <w:rPr>
                 <w:rFonts w:asciiTheme="majorHAnsi" w:eastAsia="Calibri" w:hAnsiTheme="majorHAnsi" w:cs="Arial"/>
@@ -661,7 +622,6 @@
               </w:rPr>
               <w:t>equipment_type</w:t>
             </w:r>
-            <w:proofErr w:type="spellEnd"/>
             <w:r>
               <w:rPr>
                 <w:rFonts w:asciiTheme="majorHAnsi" w:eastAsia="Calibri" w:hAnsiTheme="majorHAnsi" w:cs="Arial"/>
@@ -758,7 +718,6 @@
               </w:rPr>
               <w:t>${</w:t>
             </w:r>
-            <w:proofErr w:type="spellStart"/>
             <w:r>
               <w:rPr>
                 <w:rFonts w:asciiTheme="majorHAnsi" w:eastAsia="Calibri" w:hAnsiTheme="majorHAnsi" w:cs="Arial"/>
@@ -769,7 +728,6 @@
               </w:rPr>
               <w:t>equipment_number</w:t>
             </w:r>
-            <w:proofErr w:type="spellEnd"/>
             <w:r>
               <w:rPr>
                 <w:rFonts w:asciiTheme="majorHAnsi" w:eastAsia="Calibri" w:hAnsiTheme="majorHAnsi" w:cs="Arial"/>
@@ -834,7 +792,6 @@
               </w:rPr>
               <w:t>${</w:t>
             </w:r>
-            <w:proofErr w:type="spellStart"/>
             <w:r>
               <w:rPr>
                 <w:rFonts w:asciiTheme="majorHAnsi" w:eastAsia="Calibri" w:hAnsiTheme="majorHAnsi" w:cs="Arial"/>
@@ -845,7 +802,6 @@
               </w:rPr>
               <w:t>equipment_code</w:t>
             </w:r>
-            <w:proofErr w:type="spellEnd"/>
             <w:r>
               <w:rPr>
                 <w:rFonts w:asciiTheme="majorHAnsi" w:eastAsia="Calibri" w:hAnsiTheme="majorHAnsi" w:cs="Arial"/>
@@ -1240,7 +1196,6 @@
               </w:rPr>
               <w:t>${</w:t>
             </w:r>
-            <w:proofErr w:type="spellStart"/>
             <w:r>
               <w:rPr>
                 <w:rFonts w:eastAsia="Calibri" w:cs="Arial"/>
@@ -1249,7 +1204,6 @@
               </w:rPr>
               <w:t>row_serial</w:t>
             </w:r>
-            <w:proofErr w:type="spellEnd"/>
             <w:r>
               <w:rPr>
                 <w:rFonts w:eastAsia="Calibri" w:cs="Arial"/>
@@ -1282,7 +1236,6 @@
               </w:rPr>
               <w:t>${</w:t>
             </w:r>
-            <w:proofErr w:type="spellStart"/>
             <w:r>
               <w:rPr>
                 <w:rFonts w:eastAsia="Calibri" w:cs="Arial"/>
@@ -1291,7 +1244,6 @@
               </w:rPr>
               <w:t>row_date</w:t>
             </w:r>
-            <w:proofErr w:type="spellEnd"/>
             <w:r>
               <w:rPr>
                 <w:rFonts w:eastAsia="Calibri" w:cs="Arial"/>
@@ -1413,1427 +1365,15 @@
                 <w:bCs/>
               </w:rPr>
             </w:pPr>
-          </w:p>
-        </w:tc>
-      </w:tr>
-    </w:tbl>
-    <w:p/>
-    <w:p>
-      <w:pPr>
-        <w:rPr>
-          <w:rtl/>
-        </w:rPr>
-      </w:pPr>
-      <w:r>
-        <w:rPr>
-          <w:noProof/>
-        </w:rPr>
-        <w:drawing>
-          <wp:inline distT="0" distB="0" distL="0" distR="0" wp14:anchorId="6FF1B0D0" wp14:editId="26190D01">
-            <wp:extent cx="5273675" cy="347345"/>
-            <wp:effectExtent l="0" t="0" r="3175" b="0"/>
-            <wp:docPr id="2" name="صورة 1"/>
-            <wp:cNvGraphicFramePr>
-              <a:graphicFrameLocks xmlns:a="http://schemas.openxmlformats.org/drawingml/2006/main" noChangeAspect="1"/>
-            </wp:cNvGraphicFramePr>
-            <a:graphic xmlns:a="http://schemas.openxmlformats.org/drawingml/2006/main">
-              <a:graphicData uri="http://schemas.openxmlformats.org/drawingml/2006/picture">
-                <pic:pic xmlns:pic="http://schemas.openxmlformats.org/drawingml/2006/picture">
-                  <pic:nvPicPr>
-                    <pic:cNvPr id="0" name="Picture 2"/>
-                    <pic:cNvPicPr>
-                      <a:picLocks noChangeAspect="1" noChangeArrowheads="1"/>
-                    </pic:cNvPicPr>
-                  </pic:nvPicPr>
-                  <pic:blipFill>
-                    <a:blip r:embed="rId4">
-                      <a:extLst>
-                        <a:ext uri="{28A0092B-C50C-407E-A947-70E740481C1C}">
-                          <a14:useLocalDpi xmlns:a14="http://schemas.microsoft.com/office/drawing/2010/main" val="0"/>
-                        </a:ext>
-                      </a:extLst>
-                    </a:blip>
-                    <a:srcRect/>
-                    <a:stretch>
-                      <a:fillRect/>
-                    </a:stretch>
-                  </pic:blipFill>
-                  <pic:spPr bwMode="auto">
-                    <a:xfrm>
-                      <a:off x="0" y="0"/>
-                      <a:ext cx="5273675" cy="347345"/>
-                    </a:xfrm>
-                    <a:prstGeom prst="rect">
-                      <a:avLst/>
-                    </a:prstGeom>
-                    <a:noFill/>
-                  </pic:spPr>
-                </pic:pic>
-              </a:graphicData>
-            </a:graphic>
-          </wp:inline>
-        </w:drawing>
-      </w:r>
-    </w:p>
-    <w:p>
-      <w:pPr>
-        <w:rPr>
-          <w:rtl/>
-        </w:rPr>
-      </w:pPr>
-    </w:p>
-    <w:tbl>
-      <w:tblPr>
-        <w:tblStyle w:val="TableGrid"/>
-        <w:bidiVisual/>
-        <w:tblW w:w="11790" w:type="dxa"/>
-        <w:jc w:val="center"/>
-        <w:tblLook w:val="04A0" w:firstRow="1" w:lastRow="0" w:firstColumn="1" w:lastColumn="0" w:noHBand="0" w:noVBand="1"/>
-      </w:tblPr>
-      <w:tblGrid>
-        <w:gridCol w:w="3428"/>
-        <w:gridCol w:w="3127"/>
-        <w:gridCol w:w="2251"/>
-        <w:gridCol w:w="2984"/>
-      </w:tblGrid>
-      <w:tr>
-        <w:trPr>
-          <w:jc w:val="center"/>
-        </w:trPr>
-        <w:tc>
-          <w:tcPr>
-            <w:tcW w:w="3568" w:type="dxa"/>
-            <w:shd w:val="clear" w:color="auto" w:fill="C6D9F1" w:themeFill="text2" w:themeFillTint="33"/>
-          </w:tcPr>
-          <w:p>
-            <w:pPr>
-              <w:rPr>
-                <w:rFonts w:asciiTheme="majorHAnsi" w:hAnsiTheme="majorHAnsi"/>
-                <w:sz w:val="32"/>
-                <w:szCs w:val="32"/>
-                <w:rtl/>
-                <w:lang w:bidi="ar-EG"/>
-              </w:rPr>
-            </w:pPr>
-            <w:r>
-              <w:rPr>
-                <w:rFonts w:asciiTheme="majorHAnsi" w:hAnsiTheme="majorHAnsi"/>
-                <w:sz w:val="32"/>
-                <w:szCs w:val="32"/>
-                <w:rtl/>
-              </w:rPr>
-              <w:t>إسم المشروع</w:t>
-            </w:r>
-            <w:r>
-              <w:rPr>
-                <w:rFonts w:asciiTheme="majorHAnsi" w:hAnsiTheme="majorHAnsi" w:hint="cs"/>
-                <w:sz w:val="32"/>
-                <w:szCs w:val="32"/>
-                <w:rtl/>
-              </w:rPr>
-              <w:t>:</w:t>
-            </w:r>
-            <w:r>
-              <w:rPr>
-                <w:rFonts w:asciiTheme="majorHAnsi" w:hAnsiTheme="majorHAnsi"/>
-                <w:sz w:val="32"/>
-                <w:szCs w:val="32"/>
-                <w:lang w:bidi="ar-EG"/>
-              </w:rPr>
-              <w:t xml:space="preserve"> </w:t>
-            </w:r>
-          </w:p>
-        </w:tc>
-        <w:tc>
-          <w:tcPr>
-            <w:tcW w:w="8222" w:type="dxa"/>
-            <w:gridSpan w:val="3"/>
-          </w:tcPr>
-          <w:p>
-            <w:pPr>
-              <w:jc w:val="center"/>
-              <w:rPr>
-                <w:rFonts w:asciiTheme="majorHAnsi" w:hAnsiTheme="majorHAnsi"/>
-                <w:b/>
-                <w:bCs/>
-                <w:sz w:val="32"/>
-                <w:szCs w:val="32"/>
-                <w:rtl/>
-              </w:rPr>
-            </w:pPr>
-            <w:r>
-              <w:rPr>
-                <w:rFonts w:asciiTheme="majorHAnsi" w:hAnsiTheme="majorHAnsi"/>
-                <w:b/>
-                <w:bCs/>
-                <w:sz w:val="32"/>
-                <w:szCs w:val="32"/>
-                <w:rtl/>
-              </w:rPr>
-              <w:t>محطة كهرباء أبيدوس2 للطاقة الشمسية بقدرة 1000 ميجاوات</w:t>
-            </w:r>
-          </w:p>
-          <w:p>
-            <w:pPr>
-              <w:jc w:val="center"/>
-              <w:rPr>
-                <w:rFonts w:asciiTheme="majorHAnsi" w:hAnsiTheme="majorHAnsi"/>
-                <w:sz w:val="32"/>
-                <w:szCs w:val="32"/>
-                <w:lang w:bidi="ar-EG"/>
-              </w:rPr>
-            </w:pPr>
-            <w:r>
-              <w:rPr>
-                <w:rFonts w:asciiTheme="majorHAnsi" w:hAnsiTheme="majorHAnsi"/>
-                <w:b/>
-                <w:bCs/>
-                <w:sz w:val="32"/>
-                <w:szCs w:val="32"/>
-                <w:rtl/>
-              </w:rPr>
-              <w:t xml:space="preserve"> </w:t>
-            </w:r>
-            <w:r>
-              <w:rPr>
-                <w:rFonts w:asciiTheme="majorHAnsi" w:hAnsiTheme="majorHAnsi"/>
-                <w:b/>
-                <w:bCs/>
-                <w:sz w:val="32"/>
-                <w:szCs w:val="32"/>
-                <w:lang w:bidi="ar-EG"/>
-              </w:rPr>
-              <w:t>PV Power Plant Abydos2 Solar (MW1000)</w:t>
-            </w:r>
-          </w:p>
-        </w:tc>
-      </w:tr>
-      <w:tr>
-        <w:trPr>
-          <w:jc w:val="center"/>
-        </w:trPr>
-        <w:tc>
-          <w:tcPr>
-            <w:tcW w:w="3568" w:type="dxa"/>
-            <w:shd w:val="clear" w:color="auto" w:fill="C6D9F1" w:themeFill="text2" w:themeFillTint="33"/>
-          </w:tcPr>
-          <w:p>
-            <w:pPr>
-              <w:rPr>
-                <w:rFonts w:asciiTheme="majorHAnsi" w:hAnsiTheme="majorHAnsi"/>
-                <w:sz w:val="32"/>
-                <w:szCs w:val="32"/>
-                <w:rtl/>
-                <w:lang w:bidi="ar-EG"/>
-              </w:rPr>
-            </w:pPr>
-            <w:r>
-              <w:rPr>
-                <w:rFonts w:asciiTheme="majorHAnsi" w:hAnsiTheme="majorHAnsi"/>
-                <w:sz w:val="32"/>
-                <w:szCs w:val="32"/>
-                <w:rtl/>
-              </w:rPr>
-              <w:t>إسم الشركة</w:t>
-            </w:r>
-            <w:r>
-              <w:rPr>
-                <w:rFonts w:asciiTheme="majorHAnsi" w:hAnsiTheme="majorHAnsi" w:hint="cs"/>
-                <w:sz w:val="32"/>
-                <w:szCs w:val="32"/>
-                <w:rtl/>
-              </w:rPr>
-              <w:t>:</w:t>
-            </w:r>
-            <w:r>
-              <w:rPr>
-                <w:rFonts w:asciiTheme="majorHAnsi" w:hAnsiTheme="majorHAnsi"/>
-                <w:sz w:val="32"/>
-                <w:szCs w:val="32"/>
-                <w:lang w:bidi="ar-EG"/>
-              </w:rPr>
-              <w:t xml:space="preserve"> </w:t>
-            </w:r>
-          </w:p>
-        </w:tc>
-        <w:tc>
-          <w:tcPr>
-            <w:tcW w:w="8222" w:type="dxa"/>
-            <w:gridSpan w:val="3"/>
-          </w:tcPr>
-          <w:p>
-            <w:pPr>
-              <w:rPr>
-                <w:rFonts w:asciiTheme="majorHAnsi" w:hAnsiTheme="majorHAnsi"/>
-                <w:b/>
-                <w:bCs/>
-                <w:sz w:val="32"/>
-                <w:szCs w:val="32"/>
-                <w:rtl/>
-              </w:rPr>
-            </w:pPr>
-            <w:r>
-              <w:rPr>
-                <w:rFonts w:asciiTheme="majorHAnsi" w:hAnsiTheme="majorHAnsi"/>
-                <w:b/>
-                <w:bCs/>
-                <w:sz w:val="32"/>
-                <w:szCs w:val="32"/>
-                <w:rtl/>
-              </w:rPr>
-              <w:t>تحالف الشيماء الزراعية للمقاولات والتوريدات+</w:t>
-            </w:r>
-            <w:r>
-              <w:rPr>
-                <w:rFonts w:asciiTheme="majorHAnsi" w:hAnsiTheme="majorHAnsi"/>
-                <w:b/>
-                <w:bCs/>
-                <w:sz w:val="32"/>
-                <w:szCs w:val="32"/>
-                <w:lang w:bidi="ar-EG"/>
-              </w:rPr>
-              <w:t>FM</w:t>
-            </w:r>
-            <w:r>
-              <w:rPr>
-                <w:rFonts w:asciiTheme="majorHAnsi" w:hAnsiTheme="majorHAnsi"/>
-                <w:b/>
-                <w:bCs/>
-                <w:sz w:val="32"/>
-                <w:szCs w:val="32"/>
-                <w:rtl/>
-              </w:rPr>
-              <w:t xml:space="preserve"> للمقاولات </w:t>
-            </w:r>
-          </w:p>
-        </w:tc>
-      </w:tr>
-      <w:tr>
-        <w:trPr>
-          <w:jc w:val="center"/>
-        </w:trPr>
-        <w:tc>
-          <w:tcPr>
-            <w:tcW w:w="3568" w:type="dxa"/>
-            <w:shd w:val="clear" w:color="auto" w:fill="C6D9F1" w:themeFill="text2" w:themeFillTint="33"/>
-          </w:tcPr>
-          <w:p>
-            <w:pPr>
-              <w:rPr>
-                <w:rFonts w:asciiTheme="majorHAnsi" w:hAnsiTheme="majorHAnsi"/>
-                <w:sz w:val="32"/>
-                <w:szCs w:val="32"/>
-                <w:rtl/>
-                <w:lang w:bidi="ar-EG"/>
-              </w:rPr>
-            </w:pPr>
-            <w:r>
-              <w:rPr>
-                <w:rFonts w:asciiTheme="majorHAnsi" w:hAnsiTheme="majorHAnsi"/>
-                <w:sz w:val="32"/>
-                <w:szCs w:val="32"/>
-                <w:rtl/>
-              </w:rPr>
-              <w:t xml:space="preserve">إسم </w:t>
-            </w:r>
-            <w:r>
-              <w:rPr>
-                <w:rFonts w:asciiTheme="majorHAnsi" w:hAnsiTheme="majorHAnsi" w:hint="cs"/>
-                <w:sz w:val="32"/>
-                <w:szCs w:val="32"/>
-                <w:rtl/>
-              </w:rPr>
-              <w:t>السائق:</w:t>
-            </w:r>
-            <w:r>
-              <w:rPr>
-                <w:rFonts w:asciiTheme="majorHAnsi" w:hAnsiTheme="majorHAnsi"/>
-                <w:sz w:val="32"/>
-                <w:szCs w:val="32"/>
-                <w:rtl/>
-              </w:rPr>
-              <w:t xml:space="preserve">  </w:t>
-            </w:r>
-          </w:p>
-        </w:tc>
-        <w:tc>
-          <w:tcPr>
-            <w:tcW w:w="2880" w:type="dxa"/>
-          </w:tcPr>
-          <w:p>
-            <w:pPr>
-              <w:jc w:val="center"/>
-              <w:rPr>
-                <w:rFonts w:asciiTheme="majorHAnsi" w:hAnsiTheme="majorHAnsi"/>
-                <w:b/>
-                <w:bCs/>
-                <w:sz w:val="32"/>
-                <w:szCs w:val="32"/>
-                <w:rtl/>
-              </w:rPr>
-            </w:pPr>
-            <w:r>
-              <w:rPr>
-                <w:rFonts w:asciiTheme="majorHAnsi" w:eastAsia="Calibri" w:hAnsiTheme="majorHAnsi"/>
-                <w:b/>
-                <w:bCs/>
-                <w:sz w:val="24"/>
-                <w:szCs w:val="24"/>
-                <w:lang w:bidi="ar-EG"/>
-              </w:rPr>
-              <w:t>${</w:t>
-            </w:r>
-            <w:proofErr w:type="spellStart"/>
-            <w:r>
-              <w:rPr>
-                <w:rFonts w:asciiTheme="majorHAnsi" w:eastAsia="Calibri" w:hAnsiTheme="majorHAnsi"/>
-                <w:b/>
-                <w:bCs/>
-                <w:sz w:val="24"/>
-                <w:szCs w:val="24"/>
-                <w:lang w:bidi="ar-EG"/>
-              </w:rPr>
-              <w:t>worker_name</w:t>
-            </w:r>
-            <w:proofErr w:type="spellEnd"/>
-            <w:r>
-              <w:rPr>
-                <w:rFonts w:asciiTheme="majorHAnsi" w:eastAsia="Calibri" w:hAnsiTheme="majorHAnsi"/>
-                <w:b/>
-                <w:bCs/>
-                <w:sz w:val="24"/>
-                <w:szCs w:val="24"/>
-                <w:lang w:bidi="ar-EG"/>
-              </w:rPr>
-              <w:t>}</w:t>
-            </w:r>
-          </w:p>
-        </w:tc>
-        <w:tc>
-          <w:tcPr>
-            <w:tcW w:w="2340" w:type="dxa"/>
-            <w:shd w:val="clear" w:color="auto" w:fill="C6D9F1" w:themeFill="text2" w:themeFillTint="33"/>
-          </w:tcPr>
-          <w:p>
-            <w:pPr>
-              <w:rPr>
-                <w:rFonts w:asciiTheme="majorHAnsi" w:hAnsiTheme="majorHAnsi"/>
-                <w:sz w:val="28"/>
-                <w:szCs w:val="28"/>
-                <w:rtl/>
-              </w:rPr>
-            </w:pPr>
-            <w:r>
-              <w:rPr>
-                <w:rFonts w:asciiTheme="majorHAnsi" w:hAnsiTheme="majorHAnsi" w:hint="cs"/>
-                <w:sz w:val="28"/>
-                <w:szCs w:val="28"/>
-                <w:rtl/>
-              </w:rPr>
-              <w:t xml:space="preserve">وقت </w:t>
-            </w:r>
-            <w:proofErr w:type="gramStart"/>
-            <w:r>
-              <w:rPr>
-                <w:rFonts w:asciiTheme="majorHAnsi" w:hAnsiTheme="majorHAnsi" w:hint="cs"/>
-                <w:sz w:val="28"/>
-                <w:szCs w:val="28"/>
-                <w:rtl/>
-              </w:rPr>
-              <w:t>الشيفت :</w:t>
-            </w:r>
-            <w:proofErr w:type="gramEnd"/>
-          </w:p>
-        </w:tc>
-        <w:tc>
-          <w:tcPr>
-            <w:tcW w:w="3002" w:type="dxa"/>
-          </w:tcPr>
-          <w:p>
-            <w:pPr>
-              <w:jc w:val="center"/>
-              <w:rPr>
-                <w:rFonts w:asciiTheme="majorHAnsi" w:hAnsiTheme="majorHAnsi"/>
-                <w:b/>
-                <w:bCs/>
-                <w:sz w:val="32"/>
-                <w:szCs w:val="32"/>
-                <w:rtl/>
-              </w:rPr>
-            </w:pPr>
-            <w:r>
-              <w:rPr>
-                <w:rFonts w:asciiTheme="majorHAnsi" w:hAnsiTheme="majorHAnsi" w:hint="cs"/>
-                <w:b/>
-                <w:bCs/>
-                <w:sz w:val="32"/>
-                <w:szCs w:val="32"/>
-                <w:rtl/>
-              </w:rPr>
-              <w:t>ليلي</w:t>
-            </w:r>
-          </w:p>
-        </w:tc>
-      </w:tr>
-      <w:tr>
-        <w:trPr>
-          <w:jc w:val="center"/>
-        </w:trPr>
-        <w:tc>
-          <w:tcPr>
-            <w:tcW w:w="3568" w:type="dxa"/>
-            <w:shd w:val="clear" w:color="auto" w:fill="C6D9F1" w:themeFill="text2" w:themeFillTint="33"/>
-          </w:tcPr>
-          <w:p>
-            <w:pPr>
-              <w:tabs>
-                <w:tab w:val="right" w:pos="2632"/>
-              </w:tabs>
-              <w:rPr>
-                <w:rFonts w:asciiTheme="majorHAnsi" w:hAnsiTheme="majorHAnsi"/>
-                <w:sz w:val="32"/>
-                <w:szCs w:val="32"/>
-                <w:rtl/>
-                <w:lang w:bidi="ar-EG"/>
-              </w:rPr>
-            </w:pPr>
-            <w:r>
-              <w:rPr>
-                <w:rFonts w:asciiTheme="majorHAnsi" w:hAnsiTheme="majorHAnsi" w:hint="cs"/>
-                <w:sz w:val="32"/>
-                <w:szCs w:val="32"/>
-                <w:rtl/>
-              </w:rPr>
-              <w:t>موديل</w:t>
-            </w:r>
-            <w:r>
-              <w:rPr>
-                <w:rFonts w:asciiTheme="majorHAnsi" w:hAnsiTheme="majorHAnsi"/>
-                <w:sz w:val="32"/>
-                <w:szCs w:val="32"/>
-                <w:rtl/>
-              </w:rPr>
-              <w:t xml:space="preserve"> </w:t>
-            </w:r>
-            <w:r>
-              <w:rPr>
-                <w:rFonts w:asciiTheme="majorHAnsi" w:hAnsiTheme="majorHAnsi" w:hint="cs"/>
-                <w:sz w:val="32"/>
-                <w:szCs w:val="32"/>
-                <w:rtl/>
-              </w:rPr>
-              <w:t>المعدة:</w:t>
-            </w:r>
-            <w:r>
-              <w:rPr>
-                <w:rFonts w:asciiTheme="majorHAnsi" w:hAnsiTheme="majorHAnsi"/>
-                <w:sz w:val="32"/>
-                <w:szCs w:val="32"/>
-                <w:rtl/>
-              </w:rPr>
-              <w:t xml:space="preserve"> </w:t>
-            </w:r>
-          </w:p>
-        </w:tc>
-        <w:tc>
-          <w:tcPr>
-            <w:tcW w:w="2880" w:type="dxa"/>
-          </w:tcPr>
-          <w:p>
-            <w:pPr>
-              <w:jc w:val="center"/>
-              <w:rPr>
-                <w:rFonts w:asciiTheme="majorHAnsi" w:hAnsiTheme="majorHAnsi"/>
-                <w:b/>
-                <w:bCs/>
-                <w:sz w:val="24"/>
-                <w:szCs w:val="24"/>
-                <w:rtl/>
-              </w:rPr>
-            </w:pPr>
-            <w:r>
-              <w:rPr>
-                <w:rFonts w:asciiTheme="majorHAnsi" w:eastAsia="Calibri" w:hAnsiTheme="majorHAnsi" w:cs="Arial"/>
-                <w:b/>
-                <w:bCs/>
-                <w:sz w:val="28"/>
-                <w:szCs w:val="28"/>
-              </w:rPr>
-              <w:t>${</w:t>
-            </w:r>
-            <w:proofErr w:type="spellStart"/>
-            <w:r>
-              <w:rPr>
-                <w:rFonts w:asciiTheme="majorHAnsi" w:eastAsia="Calibri" w:hAnsiTheme="majorHAnsi" w:cs="Arial"/>
-                <w:b/>
-                <w:bCs/>
-                <w:sz w:val="28"/>
-                <w:szCs w:val="28"/>
-              </w:rPr>
-              <w:t>equipment</w:t>
-            </w:r>
-            <w:r>
-              <w:rPr>
-                <w:rFonts w:asciiTheme="majorHAnsi" w:eastAsia="Calibri" w:hAnsiTheme="majorHAnsi" w:cs="Arial"/>
-                <w:b/>
-                <w:bCs/>
-                <w:sz w:val="28"/>
-                <w:szCs w:val="28"/>
-              </w:rPr>
-              <w:t>_</w:t>
-            </w:r>
-            <w:r>
-              <w:rPr>
-                <w:rFonts w:asciiTheme="majorHAnsi" w:eastAsia="Calibri" w:hAnsiTheme="majorHAnsi" w:cs="Arial"/>
-                <w:b/>
-                <w:bCs/>
-                <w:sz w:val="28"/>
-                <w:szCs w:val="28"/>
-              </w:rPr>
-              <w:t>model</w:t>
-            </w:r>
-            <w:proofErr w:type="spellEnd"/>
-            <w:r>
-              <w:rPr>
-                <w:rFonts w:asciiTheme="majorHAnsi" w:eastAsia="Calibri" w:hAnsiTheme="majorHAnsi" w:cs="Arial"/>
-                <w:b/>
-                <w:bCs/>
-                <w:sz w:val="28"/>
-                <w:szCs w:val="28"/>
-              </w:rPr>
-              <w:t>}</w:t>
-            </w:r>
-          </w:p>
-        </w:tc>
-        <w:tc>
-          <w:tcPr>
-            <w:tcW w:w="2340" w:type="dxa"/>
-            <w:shd w:val="clear" w:color="auto" w:fill="C6D9F1" w:themeFill="text2" w:themeFillTint="33"/>
-          </w:tcPr>
-          <w:p>
-            <w:pPr>
-              <w:rPr>
-                <w:rFonts w:asciiTheme="majorHAnsi" w:hAnsiTheme="majorHAnsi"/>
-                <w:sz w:val="32"/>
-                <w:szCs w:val="32"/>
-                <w:rtl/>
-                <w:lang w:bidi="ar-EG"/>
-              </w:rPr>
-            </w:pPr>
-            <w:r>
-              <w:rPr>
-                <w:rFonts w:asciiTheme="majorHAnsi" w:hAnsiTheme="majorHAnsi" w:hint="cs"/>
-                <w:sz w:val="28"/>
-                <w:szCs w:val="28"/>
-                <w:rtl/>
-              </w:rPr>
-              <w:t>نوع المعدة:</w:t>
-            </w:r>
-            <w:r>
-              <w:rPr>
-                <w:rFonts w:asciiTheme="majorHAnsi" w:hAnsiTheme="majorHAnsi" w:hint="cs"/>
-                <w:sz w:val="28"/>
-                <w:szCs w:val="28"/>
-                <w:rtl/>
-              </w:rPr>
-              <w:t xml:space="preserve"> </w:t>
-            </w:r>
-          </w:p>
-        </w:tc>
-        <w:tc>
-          <w:tcPr>
-            <w:tcW w:w="3002" w:type="dxa"/>
-          </w:tcPr>
-          <w:p>
-            <w:pPr>
-              <w:jc w:val="center"/>
-              <w:rPr>
-                <w:rFonts w:asciiTheme="majorHAnsi" w:hAnsiTheme="majorHAnsi"/>
-                <w:b/>
-                <w:bCs/>
-                <w:sz w:val="32"/>
-                <w:szCs w:val="32"/>
-                <w:rtl/>
-              </w:rPr>
-            </w:pPr>
-            <w:r>
-              <w:rPr>
-                <w:rFonts w:asciiTheme="majorHAnsi" w:eastAsia="Calibri" w:hAnsiTheme="majorHAnsi" w:cs="Arial"/>
-                <w:b/>
-                <w:bCs/>
-                <w:sz w:val="28"/>
-                <w:szCs w:val="28"/>
-              </w:rPr>
-              <w:t>${</w:t>
-            </w:r>
-            <w:proofErr w:type="spellStart"/>
-            <w:r>
-              <w:rPr>
-                <w:rFonts w:asciiTheme="majorHAnsi" w:eastAsia="Calibri" w:hAnsiTheme="majorHAnsi" w:cs="Arial"/>
-                <w:b/>
-                <w:bCs/>
-                <w:sz w:val="28"/>
-                <w:szCs w:val="28"/>
-              </w:rPr>
-              <w:t>equipment_type</w:t>
-            </w:r>
-            <w:proofErr w:type="spellEnd"/>
-            <w:r>
-              <w:rPr>
-                <w:rFonts w:asciiTheme="majorHAnsi" w:eastAsia="Calibri" w:hAnsiTheme="majorHAnsi" w:cs="Arial"/>
-                <w:b/>
-                <w:bCs/>
-                <w:sz w:val="28"/>
-                <w:szCs w:val="28"/>
-              </w:rPr>
-              <w:t>}</w:t>
-            </w:r>
-          </w:p>
-        </w:tc>
-      </w:tr>
-      <w:tr>
-        <w:trPr>
-          <w:jc w:val="center"/>
-        </w:trPr>
-        <w:tc>
-          <w:tcPr>
-            <w:tcW w:w="3568" w:type="dxa"/>
-            <w:shd w:val="clear" w:color="auto" w:fill="C6D9F1" w:themeFill="text2" w:themeFillTint="33"/>
-          </w:tcPr>
-          <w:p>
-            <w:pPr>
-              <w:rPr>
-                <w:rFonts w:asciiTheme="majorHAnsi" w:hAnsiTheme="majorHAnsi"/>
-                <w:sz w:val="32"/>
-                <w:szCs w:val="32"/>
-                <w:rtl/>
-                <w:lang w:bidi="ar-EG"/>
-              </w:rPr>
-            </w:pPr>
-            <w:r>
-              <w:rPr>
-                <w:rFonts w:asciiTheme="majorHAnsi" w:hAnsiTheme="majorHAnsi" w:hint="cs"/>
-                <w:sz w:val="32"/>
-                <w:szCs w:val="32"/>
-                <w:rtl/>
-              </w:rPr>
-              <w:t>رقم</w:t>
-            </w:r>
-            <w:r>
-              <w:rPr>
-                <w:rFonts w:asciiTheme="majorHAnsi" w:hAnsiTheme="majorHAnsi"/>
-                <w:sz w:val="32"/>
-                <w:szCs w:val="32"/>
-                <w:rtl/>
-              </w:rPr>
-              <w:t xml:space="preserve"> </w:t>
-            </w:r>
-            <w:r>
-              <w:rPr>
-                <w:rFonts w:asciiTheme="majorHAnsi" w:hAnsiTheme="majorHAnsi" w:hint="cs"/>
-                <w:sz w:val="32"/>
-                <w:szCs w:val="32"/>
-                <w:rtl/>
-              </w:rPr>
-              <w:t>شاسيه المعدة:</w:t>
-            </w:r>
-            <w:r>
-              <w:rPr>
-                <w:rFonts w:asciiTheme="majorHAnsi" w:hAnsiTheme="majorHAnsi"/>
-                <w:sz w:val="32"/>
-                <w:szCs w:val="32"/>
-                <w:rtl/>
-              </w:rPr>
-              <w:t xml:space="preserve"> </w:t>
-            </w:r>
-          </w:p>
-        </w:tc>
-        <w:tc>
-          <w:tcPr>
-            <w:tcW w:w="2880" w:type="dxa"/>
-          </w:tcPr>
-          <w:p>
-            <w:pPr>
-              <w:jc w:val="center"/>
-              <w:rPr>
-                <w:rFonts w:asciiTheme="majorHAnsi" w:hAnsiTheme="majorHAnsi"/>
-                <w:b/>
-                <w:bCs/>
-                <w:sz w:val="32"/>
-                <w:szCs w:val="32"/>
-                <w:rtl/>
-              </w:rPr>
-            </w:pPr>
-            <w:r>
-              <w:rPr>
-                <w:rFonts w:asciiTheme="majorHAnsi" w:eastAsia="Calibri" w:hAnsiTheme="majorHAnsi" w:cs="Arial"/>
-                <w:b/>
-                <w:bCs/>
-                <w:sz w:val="28"/>
-                <w:szCs w:val="28"/>
-              </w:rPr>
-              <w:t>${</w:t>
-            </w:r>
-            <w:proofErr w:type="spellStart"/>
-            <w:r>
-              <w:rPr>
-                <w:rFonts w:asciiTheme="majorHAnsi" w:eastAsia="Calibri" w:hAnsiTheme="majorHAnsi" w:cs="Arial"/>
-                <w:b/>
-                <w:bCs/>
-                <w:sz w:val="28"/>
-                <w:szCs w:val="28"/>
-              </w:rPr>
-              <w:t>equipment_number</w:t>
-            </w:r>
-            <w:proofErr w:type="spellEnd"/>
-            <w:r>
-              <w:rPr>
-                <w:rFonts w:asciiTheme="majorHAnsi" w:eastAsia="Calibri" w:hAnsiTheme="majorHAnsi" w:cs="Arial"/>
-                <w:b/>
-                <w:bCs/>
-                <w:sz w:val="28"/>
-                <w:szCs w:val="28"/>
-              </w:rPr>
-              <w:t>}</w:t>
-            </w:r>
-          </w:p>
-        </w:tc>
-        <w:tc>
-          <w:tcPr>
-            <w:tcW w:w="2340" w:type="dxa"/>
-            <w:shd w:val="clear" w:color="auto" w:fill="C6D9F1" w:themeFill="text2" w:themeFillTint="33"/>
-          </w:tcPr>
-          <w:p>
-            <w:pPr>
-              <w:rPr>
-                <w:rFonts w:asciiTheme="majorHAnsi" w:hAnsiTheme="majorHAnsi"/>
-                <w:sz w:val="32"/>
-                <w:szCs w:val="32"/>
-                <w:rtl/>
-                <w:lang w:bidi="ar-EG"/>
-              </w:rPr>
-            </w:pPr>
-            <w:r>
-              <w:rPr>
-                <w:rFonts w:asciiTheme="majorHAnsi" w:hAnsiTheme="majorHAnsi" w:hint="cs"/>
-                <w:sz w:val="32"/>
-                <w:szCs w:val="32"/>
-                <w:rtl/>
-              </w:rPr>
-              <w:t xml:space="preserve">كود المعدة: </w:t>
-            </w:r>
-          </w:p>
-        </w:tc>
-        <w:tc>
-          <w:tcPr>
-            <w:tcW w:w="3002" w:type="dxa"/>
-          </w:tcPr>
-          <w:p>
-            <w:pPr>
-              <w:jc w:val="center"/>
-              <w:rPr>
-                <w:rFonts w:asciiTheme="majorHAnsi" w:hAnsiTheme="majorHAnsi"/>
-                <w:b/>
-                <w:bCs/>
-                <w:sz w:val="32"/>
-                <w:szCs w:val="32"/>
-                <w:lang w:bidi="ar-EG"/>
-              </w:rPr>
-            </w:pPr>
-            <w:r>
-              <w:rPr>
-                <w:rFonts w:asciiTheme="majorHAnsi" w:eastAsia="Calibri" w:hAnsiTheme="majorHAnsi" w:cs="Arial"/>
-                <w:b/>
-                <w:bCs/>
-                <w:sz w:val="28"/>
-                <w:szCs w:val="28"/>
-              </w:rPr>
-              <w:t>${</w:t>
-            </w:r>
-            <w:proofErr w:type="spellStart"/>
-            <w:r>
-              <w:rPr>
-                <w:rFonts w:asciiTheme="majorHAnsi" w:eastAsia="Calibri" w:hAnsiTheme="majorHAnsi" w:cs="Arial"/>
-                <w:b/>
-                <w:bCs/>
-                <w:sz w:val="28"/>
-                <w:szCs w:val="28"/>
-              </w:rPr>
-              <w:t>equipment_code</w:t>
-            </w:r>
-            <w:proofErr w:type="spellEnd"/>
-            <w:r>
-              <w:rPr>
-                <w:rFonts w:asciiTheme="majorHAnsi" w:eastAsia="Calibri" w:hAnsiTheme="majorHAnsi" w:cs="Arial"/>
-                <w:b/>
-                <w:bCs/>
-                <w:sz w:val="28"/>
-                <w:szCs w:val="28"/>
-              </w:rPr>
-              <w:t>}</w:t>
-            </w:r>
           </w:p>
         </w:tc>
       </w:tr>
     </w:tbl>
     <w:p>
       <w:pPr>
-        <w:rPr>
-          <w:rtl/>
-        </w:rPr>
+        <w:widowControl w:val="0"/>
       </w:pPr>
     </w:p>
-    <w:tbl>
-      <w:tblPr>
-        <w:tblStyle w:val="TableGrid"/>
-        <w:bidiVisual/>
-        <w:tblW w:w="11608" w:type="dxa"/>
-        <w:jc w:val="center"/>
-        <w:tblLayout w:type="fixed"/>
-        <w:tblLook w:val="04A0" w:firstRow="1" w:lastRow="0" w:firstColumn="1" w:lastColumn="0" w:noHBand="0" w:noVBand="1"/>
-      </w:tblPr>
-      <w:tblGrid>
-        <w:gridCol w:w="830"/>
-        <w:gridCol w:w="1500"/>
-        <w:gridCol w:w="993"/>
-        <w:gridCol w:w="1081"/>
-        <w:gridCol w:w="1263"/>
-        <w:gridCol w:w="1083"/>
-        <w:gridCol w:w="1112"/>
-        <w:gridCol w:w="1211"/>
-        <w:gridCol w:w="1231"/>
-        <w:gridCol w:w="1304"/>
-      </w:tblGrid>
-      <w:tr>
-        <w:trPr>
-          <w:trHeight w:val="568"/>
-          <w:jc w:val="center"/>
-        </w:trPr>
-        <w:tc>
-          <w:tcPr>
-            <w:tcW w:w="830" w:type="dxa"/>
-            <w:shd w:val="clear" w:color="auto" w:fill="B8CCE4" w:themeFill="accent1" w:themeFillTint="66"/>
-          </w:tcPr>
-          <w:p>
-            <w:pPr>
-              <w:jc w:val="center"/>
-              <w:rPr>
-                <w:b/>
-                <w:bCs/>
-              </w:rPr>
-            </w:pPr>
-            <w:r>
-              <w:rPr>
-                <w:rFonts w:ascii="Calibri" w:eastAsia="Calibri" w:hAnsi="Calibri"/>
-                <w:b/>
-                <w:bCs/>
-                <w:rtl/>
-              </w:rPr>
-              <w:t>رقم مسلسل</w:t>
-            </w:r>
-          </w:p>
-        </w:tc>
-        <w:tc>
-          <w:tcPr>
-            <w:tcW w:w="1500" w:type="dxa"/>
-            <w:shd w:val="clear" w:color="auto" w:fill="B8CCE4" w:themeFill="accent1" w:themeFillTint="66"/>
-          </w:tcPr>
-          <w:p>
-            <w:pPr>
-              <w:jc w:val="center"/>
-              <w:rPr>
-                <w:b/>
-                <w:bCs/>
-              </w:rPr>
-            </w:pPr>
-            <w:r>
-              <w:rPr>
-                <w:rFonts w:ascii="Calibri" w:eastAsia="Calibri" w:hAnsi="Calibri"/>
-                <w:b/>
-                <w:bCs/>
-                <w:rtl/>
-              </w:rPr>
-              <w:t>التاريخ</w:t>
-            </w:r>
-          </w:p>
-        </w:tc>
-        <w:tc>
-          <w:tcPr>
-            <w:tcW w:w="993" w:type="dxa"/>
-            <w:shd w:val="clear" w:color="auto" w:fill="B8CCE4" w:themeFill="accent1" w:themeFillTint="66"/>
-          </w:tcPr>
-          <w:p>
-            <w:pPr>
-              <w:jc w:val="center"/>
-              <w:rPr>
-                <w:rFonts w:ascii="Calibri" w:eastAsia="Calibri" w:hAnsi="Calibri"/>
-                <w:b/>
-                <w:bCs/>
-                <w:rtl/>
-              </w:rPr>
-            </w:pPr>
-            <w:r>
-              <w:rPr>
-                <w:rFonts w:ascii="Calibri" w:eastAsia="Calibri" w:hAnsi="Calibri"/>
-                <w:b/>
-                <w:bCs/>
-                <w:rtl/>
-              </w:rPr>
-              <w:t xml:space="preserve">بداية </w:t>
-            </w:r>
-          </w:p>
-          <w:p>
-            <w:pPr>
-              <w:jc w:val="center"/>
-              <w:rPr>
-                <w:b/>
-                <w:bCs/>
-              </w:rPr>
-            </w:pPr>
-            <w:r>
-              <w:rPr>
-                <w:rFonts w:ascii="Calibri" w:eastAsia="Calibri" w:hAnsi="Calibri"/>
-                <w:b/>
-                <w:bCs/>
-                <w:rtl/>
-              </w:rPr>
-              <w:t>العمل</w:t>
-            </w:r>
-          </w:p>
-        </w:tc>
-        <w:tc>
-          <w:tcPr>
-            <w:tcW w:w="1081" w:type="dxa"/>
-            <w:shd w:val="clear" w:color="auto" w:fill="B8CCE4" w:themeFill="accent1" w:themeFillTint="66"/>
-          </w:tcPr>
-          <w:p>
-            <w:pPr>
-              <w:jc w:val="center"/>
-              <w:rPr>
-                <w:rFonts w:ascii="Calibri" w:eastAsia="Calibri" w:hAnsi="Calibri"/>
-                <w:b/>
-                <w:bCs/>
-                <w:rtl/>
-              </w:rPr>
-            </w:pPr>
-            <w:r>
-              <w:rPr>
-                <w:rFonts w:ascii="Calibri" w:eastAsia="Calibri" w:hAnsi="Calibri"/>
-                <w:b/>
-                <w:bCs/>
-                <w:rtl/>
-              </w:rPr>
-              <w:t xml:space="preserve">نهاية </w:t>
-            </w:r>
-          </w:p>
-          <w:p>
-            <w:pPr>
-              <w:jc w:val="center"/>
-              <w:rPr>
-                <w:b/>
-                <w:bCs/>
-              </w:rPr>
-            </w:pPr>
-            <w:r>
-              <w:rPr>
-                <w:rFonts w:ascii="Calibri" w:eastAsia="Calibri" w:hAnsi="Calibri"/>
-                <w:b/>
-                <w:bCs/>
-                <w:rtl/>
-              </w:rPr>
-              <w:t>العمل</w:t>
-            </w:r>
-          </w:p>
-        </w:tc>
-        <w:tc>
-          <w:tcPr>
-            <w:tcW w:w="1263" w:type="dxa"/>
-            <w:shd w:val="clear" w:color="auto" w:fill="B8CCE4" w:themeFill="accent1" w:themeFillTint="66"/>
-          </w:tcPr>
-          <w:p>
-            <w:pPr>
-              <w:jc w:val="center"/>
-              <w:rPr>
-                <w:rFonts w:ascii="Calibri" w:eastAsia="Calibri" w:hAnsi="Calibri"/>
-                <w:b/>
-                <w:bCs/>
-                <w:rtl/>
-              </w:rPr>
-            </w:pPr>
-            <w:r>
-              <w:rPr>
-                <w:rFonts w:ascii="Calibri" w:eastAsia="Calibri" w:hAnsi="Calibri"/>
-                <w:b/>
-                <w:bCs/>
-                <w:rtl/>
-              </w:rPr>
-              <w:t xml:space="preserve">ساعات </w:t>
-            </w:r>
-          </w:p>
-          <w:p>
-            <w:pPr>
-              <w:jc w:val="center"/>
-              <w:rPr>
-                <w:b/>
-                <w:bCs/>
-              </w:rPr>
-            </w:pPr>
-            <w:r>
-              <w:rPr>
-                <w:rFonts w:ascii="Calibri" w:eastAsia="Calibri" w:hAnsi="Calibri"/>
-                <w:b/>
-                <w:bCs/>
-                <w:rtl/>
-              </w:rPr>
-              <w:t>الراحة</w:t>
-            </w:r>
-          </w:p>
-        </w:tc>
-        <w:tc>
-          <w:tcPr>
-            <w:tcW w:w="1083" w:type="dxa"/>
-            <w:shd w:val="clear" w:color="auto" w:fill="B8CCE4" w:themeFill="accent1" w:themeFillTint="66"/>
-          </w:tcPr>
-          <w:p>
-            <w:pPr>
-              <w:jc w:val="center"/>
-              <w:rPr>
-                <w:b/>
-                <w:bCs/>
-              </w:rPr>
-            </w:pPr>
-            <w:r>
-              <w:rPr>
-                <w:rFonts w:ascii="Calibri" w:eastAsia="Calibri" w:hAnsi="Calibri"/>
-                <w:b/>
-                <w:bCs/>
-                <w:rtl/>
-              </w:rPr>
-              <w:t>عدد ساعات العمل</w:t>
-            </w:r>
-          </w:p>
-        </w:tc>
-        <w:tc>
-          <w:tcPr>
-            <w:tcW w:w="1112" w:type="dxa"/>
-            <w:shd w:val="clear" w:color="auto" w:fill="B8CCE4" w:themeFill="accent1" w:themeFillTint="66"/>
-          </w:tcPr>
-          <w:p>
-            <w:pPr>
-              <w:jc w:val="center"/>
-              <w:rPr>
-                <w:rFonts w:ascii="Calibri" w:eastAsia="Calibri" w:hAnsi="Calibri"/>
-                <w:b/>
-                <w:bCs/>
-                <w:rtl/>
-              </w:rPr>
-            </w:pPr>
-            <w:r>
-              <w:rPr>
-                <w:rFonts w:ascii="Calibri" w:eastAsia="Calibri" w:hAnsi="Calibri"/>
-                <w:b/>
-                <w:bCs/>
-                <w:rtl/>
-              </w:rPr>
-              <w:t xml:space="preserve">مكان </w:t>
-            </w:r>
-          </w:p>
-          <w:p>
-            <w:pPr>
-              <w:jc w:val="center"/>
-              <w:rPr>
-                <w:b/>
-                <w:bCs/>
-              </w:rPr>
-            </w:pPr>
-            <w:r>
-              <w:rPr>
-                <w:rFonts w:ascii="Calibri" w:eastAsia="Calibri" w:hAnsi="Calibri"/>
-                <w:b/>
-                <w:bCs/>
-                <w:rtl/>
-              </w:rPr>
-              <w:t>العمل</w:t>
-            </w:r>
-          </w:p>
-        </w:tc>
-        <w:tc>
-          <w:tcPr>
-            <w:tcW w:w="1211" w:type="dxa"/>
-            <w:shd w:val="clear" w:color="auto" w:fill="B8CCE4" w:themeFill="accent1" w:themeFillTint="66"/>
-          </w:tcPr>
-          <w:p>
-            <w:pPr>
-              <w:jc w:val="center"/>
-              <w:rPr>
-                <w:b/>
-                <w:bCs/>
-              </w:rPr>
-            </w:pPr>
-            <w:r>
-              <w:rPr>
-                <w:rFonts w:ascii="Calibri" w:eastAsia="Calibri" w:hAnsi="Calibri"/>
-                <w:b/>
-                <w:bCs/>
-                <w:rtl/>
-              </w:rPr>
-              <w:t>ملاحظات</w:t>
-            </w:r>
-          </w:p>
-        </w:tc>
-        <w:tc>
-          <w:tcPr>
-            <w:tcW w:w="1231" w:type="dxa"/>
-            <w:shd w:val="clear" w:color="auto" w:fill="B8CCE4" w:themeFill="accent1" w:themeFillTint="66"/>
-          </w:tcPr>
-          <w:p>
-            <w:pPr>
-              <w:jc w:val="center"/>
-              <w:rPr>
-                <w:b/>
-                <w:bCs/>
-              </w:rPr>
-            </w:pPr>
-            <w:r>
-              <w:rPr>
-                <w:rFonts w:ascii="Calibri" w:eastAsia="Calibri" w:hAnsi="Calibri"/>
-                <w:b/>
-                <w:bCs/>
-                <w:rtl/>
-              </w:rPr>
-              <w:t>توقيع المشرف</w:t>
-            </w:r>
-          </w:p>
-        </w:tc>
-        <w:tc>
-          <w:tcPr>
-            <w:tcW w:w="1304" w:type="dxa"/>
-            <w:shd w:val="clear" w:color="auto" w:fill="B8CCE4" w:themeFill="accent1" w:themeFillTint="66"/>
-          </w:tcPr>
-          <w:p>
-            <w:pPr>
-              <w:jc w:val="center"/>
-              <w:rPr>
-                <w:b/>
-                <w:bCs/>
-              </w:rPr>
-            </w:pPr>
-            <w:r>
-              <w:rPr>
-                <w:rFonts w:ascii="Calibri" w:eastAsia="Calibri" w:hAnsi="Calibri"/>
-                <w:b/>
-                <w:bCs/>
-                <w:rtl/>
-              </w:rPr>
-              <w:t>توقيع المهندس المباشر</w:t>
-            </w:r>
-          </w:p>
-        </w:tc>
-      </w:tr>
-      <w:tr>
-        <w:trPr>
-          <w:trHeight w:val="298"/>
-          <w:jc w:val="center"/>
-        </w:trPr>
-        <w:tc>
-          <w:tcPr>
-            <w:tcW w:w="830" w:type="dxa"/>
-          </w:tcPr>
-          <w:p>
-            <w:pPr>
-              <w:jc w:val="center"/>
-              <w:rPr>
-                <w:b/>
-                <w:bCs/>
-              </w:rPr>
-            </w:pPr>
-            <w:r>
-              <w:rPr>
-                <w:rFonts w:eastAsia="Calibri" w:cs="Arial"/>
-                <w:b/>
-                <w:bCs/>
-                <w:rtl/>
-              </w:rPr>
-              <w:t>${</w:t>
-            </w:r>
-            <w:proofErr w:type="spellStart"/>
-            <w:r>
-              <w:rPr>
-                <w:rFonts w:eastAsia="Calibri" w:cs="Arial"/>
-                <w:b/>
-                <w:bCs/>
-              </w:rPr>
-              <w:t>row_serial</w:t>
-            </w:r>
-            <w:proofErr w:type="spellEnd"/>
-            <w:r>
-              <w:rPr>
-                <w:rFonts w:eastAsia="Calibri" w:cs="Arial"/>
-                <w:b/>
-                <w:bCs/>
-                <w:rtl/>
-              </w:rPr>
-              <w:t>}</w:t>
-            </w:r>
-          </w:p>
-        </w:tc>
-        <w:tc>
-          <w:tcPr>
-            <w:tcW w:w="1500" w:type="dxa"/>
-          </w:tcPr>
-          <w:p>
-            <w:pPr>
-              <w:jc w:val="center"/>
-              <w:rPr>
-                <w:b/>
-                <w:bCs/>
-              </w:rPr>
-            </w:pPr>
-            <w:r>
-              <w:rPr>
-                <w:rFonts w:eastAsia="Calibri" w:cs="Arial"/>
-                <w:b/>
-                <w:bCs/>
-                <w:rtl/>
-              </w:rPr>
-              <w:t>${</w:t>
-            </w:r>
-            <w:proofErr w:type="spellStart"/>
-            <w:r>
-              <w:rPr>
-                <w:rFonts w:eastAsia="Calibri" w:cs="Arial"/>
-                <w:b/>
-                <w:bCs/>
-              </w:rPr>
-              <w:t>row_date</w:t>
-            </w:r>
-            <w:proofErr w:type="spellEnd"/>
-            <w:r>
-              <w:rPr>
-                <w:rFonts w:eastAsia="Calibri" w:cs="Arial"/>
-                <w:b/>
-                <w:bCs/>
-                <w:rtl/>
-              </w:rPr>
-              <w:t>}</w:t>
-            </w:r>
-          </w:p>
-        </w:tc>
-        <w:tc>
-          <w:tcPr>
-            <w:tcW w:w="993" w:type="dxa"/>
-          </w:tcPr>
-          <w:p>
-            <w:pPr>
-              <w:jc w:val="center"/>
-              <w:rPr>
-                <w:b/>
-                <w:bCs/>
-              </w:rPr>
-            </w:pPr>
-          </w:p>
-        </w:tc>
-        <w:tc>
-          <w:tcPr>
-            <w:tcW w:w="1081" w:type="dxa"/>
-          </w:tcPr>
-          <w:p>
-            <w:pPr>
-              <w:jc w:val="center"/>
-              <w:rPr>
-                <w:b/>
-                <w:bCs/>
-              </w:rPr>
-            </w:pPr>
-          </w:p>
-        </w:tc>
-        <w:tc>
-          <w:tcPr>
-            <w:tcW w:w="1263" w:type="dxa"/>
-          </w:tcPr>
-          <w:p>
-            <w:pPr>
-              <w:jc w:val="center"/>
-              <w:rPr>
-                <w:b/>
-                <w:bCs/>
-              </w:rPr>
-            </w:pPr>
-          </w:p>
-        </w:tc>
-        <w:tc>
-          <w:tcPr>
-            <w:tcW w:w="1083" w:type="dxa"/>
-          </w:tcPr>
-          <w:p>
-            <w:pPr>
-              <w:jc w:val="center"/>
-              <w:rPr>
-                <w:b/>
-                <w:bCs/>
-              </w:rPr>
-            </w:pPr>
-          </w:p>
-        </w:tc>
-        <w:tc>
-          <w:tcPr>
-            <w:tcW w:w="1112" w:type="dxa"/>
-          </w:tcPr>
-          <w:p>
-            <w:pPr>
-              <w:jc w:val="center"/>
-              <w:rPr>
-                <w:b/>
-                <w:bCs/>
-              </w:rPr>
-            </w:pPr>
-          </w:p>
-        </w:tc>
-        <w:tc>
-          <w:tcPr>
-            <w:tcW w:w="1211" w:type="dxa"/>
-          </w:tcPr>
-          <w:p>
-            <w:pPr>
-              <w:jc w:val="center"/>
-              <w:rPr>
-                <w:b/>
-                <w:bCs/>
-              </w:rPr>
-            </w:pPr>
-          </w:p>
-        </w:tc>
-        <w:tc>
-          <w:tcPr>
-            <w:tcW w:w="1231" w:type="dxa"/>
-          </w:tcPr>
-          <w:p>
-            <w:pPr>
-              <w:jc w:val="center"/>
-              <w:rPr>
-                <w:b/>
-                <w:bCs/>
-              </w:rPr>
-            </w:pPr>
-          </w:p>
-        </w:tc>
-        <w:tc>
-          <w:tcPr>
-            <w:tcW w:w="1304" w:type="dxa"/>
-          </w:tcPr>
-          <w:p>
-            <w:pPr>
-              <w:jc w:val="center"/>
-              <w:rPr>
-                <w:b/>
-                <w:bCs/>
-              </w:rPr>
-            </w:pPr>
-          </w:p>
-        </w:tc>
-      </w:tr>
-    </w:tbl>
-    <w:p/>
     <w:sectPr>
       <w:pgSz w:w="12240" w:h="15840"/>
       <w:pgMar w:top="630" w:right="1440" w:bottom="540" w:left="1440" w:header="720" w:footer="720" w:gutter="0"/>

</xml_diff>

<commit_message>
fix: Remove unused padding rows in timesheet document generation and clean up template
</commit_message>
<xml_diff>
--- a/storage/app/templates/driver-worker-timesheet.docx
+++ b/storage/app/templates/driver-worker-timesheet.docx
@@ -3,20 +3,16 @@
 <w:document xmlns:wpc="http://schemas.microsoft.com/office/word/2010/wordprocessingCanvas" xmlns:cx="http://schemas.microsoft.com/office/drawing/2014/chartex" xmlns:cx1="http://schemas.microsoft.com/office/drawing/2015/9/8/chartex" xmlns:cx2="http://schemas.microsoft.com/office/drawing/2015/10/21/chartex" xmlns:cx3="http://schemas.microsoft.com/office/drawing/2016/5/9/chartex" xmlns:cx4="http://schemas.microsoft.com/office/drawing/2016/5/10/chartex" xmlns:cx5="http://schemas.microsoft.com/office/drawing/2016/5/11/chartex" xmlns:cx6="http://schemas.microsoft.com/office/drawing/2016/5/12/chartex" xmlns:cx7="http://schemas.microsoft.com/office/drawing/2016/5/13/chartex" xmlns:cx8="http://schemas.microsoft.com/office/drawing/2016/5/14/chartex" xmlns:mc="http://schemas.openxmlformats.org/markup-compatibility/2006" xmlns:aink="http://schemas.microsoft.com/office/drawing/2016/ink" xmlns:am3d="http://schemas.microsoft.com/office/drawing/2017/model3d" xmlns:o="urn:schemas-microsoft-com:office:office" xmlns:oel="http://schemas.microsoft.com/office/2019/extlst" xmlns:r="http://schemas.openxmlformats.org/officeDocument/2006/relationships" xmlns:m="http://schemas.openxmlformats.org/officeDocument/2006/math" xmlns:v="urn:schemas-microsoft-com:vml" xmlns:wp14="http://schemas.microsoft.com/office/word/2010/wordprocessingDrawing" xmlns:wp="http://schemas.openxmlformats.org/drawingml/2006/wordprocessingDrawing" xmlns:w10="urn:schemas-microsoft-com:office:word" xmlns:w="http://schemas.openxmlformats.org/wordprocessingml/2006/main" xmlns:w14="http://schemas.microsoft.com/office/word/2010/wordml" xmlns:w15="http://schemas.microsoft.com/office/word/2012/wordml" xmlns:w16cex="http://schemas.microsoft.com/office/word/2018/wordml/cex" xmlns:w16cid="http://schemas.microsoft.com/office/word/2016/wordml/cid" xmlns:w16="http://schemas.microsoft.com/office/word/2018/wordml" xmlns:w16du="http://schemas.microsoft.com/office/word/2023/wordml/word16du" xmlns:w16sdtdh="http://schemas.microsoft.com/office/word/2020/wordml/sdtdatahash" xmlns:w16sdtfl="http://schemas.microsoft.com/office/word/2024/wordml/sdtformatlock" xmlns:w16se="http://schemas.microsoft.com/office/word/2015/wordml/symex" xmlns:wpg="http://schemas.microsoft.com/office/word/2010/wordprocessingGroup" xmlns:wpi="http://schemas.microsoft.com/office/word/2010/wordprocessingInk" xmlns:wne="http://schemas.microsoft.com/office/word/2006/wordml" xmlns:wps="http://schemas.microsoft.com/office/word/2010/wordprocessingShape" mc:Ignorable="w14 w15 w16se w16cid w16 w16cex w16sdtdh w16sdtfl w16du wp14">
   <w:body>
     <w:p>
-      <w:pPr>
-        <w:rPr>
-          <w:rtl/>
-        </w:rPr>
-      </w:pPr>
       <w:r>
         <w:rPr>
           <w:noProof/>
+          <w:rtl/>
         </w:rPr>
         <w:drawing>
-          <wp:inline distT="0" distB="0" distL="0" distR="0" wp14:anchorId="320CF383" wp14:editId="35E6BD1C">
+          <wp:inline distT="0" distB="0" distL="0" distR="0" wp14:anchorId="6F8E2148" wp14:editId="3A9FBFCB">
             <wp:extent cx="5273675" cy="347345"/>
-            <wp:effectExtent l="0" t="0" r="3175" b="0"/>
-            <wp:docPr id="92" name="صورة 1"/>
+            <wp:effectExtent l="0" t="0" r="0" b="0"/>
+            <wp:docPr id="1" name="صورة 1"/>
             <wp:cNvGraphicFramePr>
               <a:graphicFrameLocks xmlns:a="http://schemas.openxmlformats.org/drawingml/2006/main" noChangeAspect="1"/>
             </wp:cNvGraphicFramePr>
@@ -24,20 +20,13 @@
               <a:graphicData uri="http://schemas.openxmlformats.org/drawingml/2006/picture">
                 <pic:pic xmlns:pic="http://schemas.openxmlformats.org/drawingml/2006/picture">
                   <pic:nvPicPr>
-                    <pic:cNvPr id="0" name="Picture 2"/>
+                    <pic:cNvPr id="1" name="صورة 1"/>
                     <pic:cNvPicPr>
                       <a:picLocks noChangeAspect="1" noChangeArrowheads="1"/>
                     </pic:cNvPicPr>
                   </pic:nvPicPr>
                   <pic:blipFill>
-                    <a:blip r:embed="rId4">
-                      <a:extLst>
-                        <a:ext uri="{28A0092B-C50C-407E-A947-70E740481C1C}">
-                          <a14:useLocalDpi xmlns:a14="http://schemas.microsoft.com/office/drawing/2010/main" val="0"/>
-                        </a:ext>
-                      </a:extLst>
-                    </a:blip>
-                    <a:srcRect/>
+                    <a:blip r:embed="rId4"/>
                     <a:stretch>
                       <a:fillRect/>
                     </a:stretch>
@@ -59,25 +48,19 @@
         </w:drawing>
       </w:r>
     </w:p>
-    <w:p>
-      <w:pPr>
-        <w:rPr>
-          <w:rtl/>
-        </w:rPr>
-      </w:pPr>
-    </w:p>
     <w:tbl>
       <w:tblPr>
         <w:tblStyle w:val="TableGrid"/>
         <w:bidiVisual/>
         <w:tblW w:w="11790" w:type="dxa"/>
         <w:jc w:val="center"/>
+        <w:tblLayout w:type="fixed"/>
         <w:tblLook w:val="04A0" w:firstRow="1" w:lastRow="0" w:firstColumn="1" w:lastColumn="0" w:noHBand="0" w:noVBand="1"/>
       </w:tblPr>
       <w:tblGrid>
         <w:gridCol w:w="3433"/>
-        <w:gridCol w:w="3127"/>
-        <w:gridCol w:w="2254"/>
+        <w:gridCol w:w="3126"/>
+        <w:gridCol w:w="2255"/>
         <w:gridCol w:w="2976"/>
       </w:tblGrid>
       <w:tr>
@@ -86,101 +69,178 @@
         </w:trPr>
         <w:tc>
           <w:tcPr>
-            <w:tcW w:w="3557" w:type="dxa"/>
+            <w:tcW w:w="3433" w:type="dxa"/>
             <w:shd w:val="clear" w:color="auto" w:fill="C6D9F1" w:themeFill="text2" w:themeFillTint="33"/>
           </w:tcPr>
           <w:p>
             <w:pPr>
+              <w:spacing w:after="0" w:line="240" w:lineRule="auto"/>
               <w:rPr>
                 <w:rFonts w:asciiTheme="majorHAnsi" w:hAnsiTheme="majorHAnsi"/>
                 <w:sz w:val="32"/>
                 <w:szCs w:val="32"/>
-                <w:rtl/>
                 <w:lang w:bidi="ar-EG"/>
               </w:rPr>
             </w:pPr>
-            <w:r>
+            <w:proofErr w:type="spellStart"/>
+            <w:r>
+              <w:rPr>
+                <w:rFonts w:asciiTheme="majorHAnsi" w:eastAsia="Calibri" w:hAnsiTheme="majorHAnsi"/>
+                <w:sz w:val="32"/>
+                <w:szCs w:val="32"/>
+                <w:rtl/>
+              </w:rPr>
+              <w:t>إسم</w:t>
+            </w:r>
+            <w:proofErr w:type="spellEnd"/>
+            <w:r>
+              <w:rPr>
+                <w:rFonts w:asciiTheme="majorHAnsi" w:eastAsia="Calibri" w:hAnsiTheme="majorHAnsi"/>
+                <w:sz w:val="32"/>
+                <w:szCs w:val="32"/>
+                <w:rtl/>
+              </w:rPr>
+              <w:t xml:space="preserve"> المشروع</w:t>
+            </w:r>
+            <w:r>
+              <w:rPr>
+                <w:rFonts w:asciiTheme="majorHAnsi" w:eastAsia="Calibri" w:hAnsiTheme="majorHAnsi" w:cs="Arial" w:hint="cs"/>
+                <w:sz w:val="32"/>
+                <w:szCs w:val="32"/>
+                <w:rtl/>
+              </w:rPr>
+              <w:t>:</w:t>
+            </w:r>
+            <w:r>
+              <w:rPr>
+                <w:rFonts w:asciiTheme="majorHAnsi" w:eastAsia="Calibri" w:hAnsiTheme="majorHAnsi" w:cs="Arial"/>
+                <w:sz w:val="32"/>
+                <w:szCs w:val="32"/>
+                <w:rtl/>
+                <w:lang w:bidi="ar-EG"/>
+              </w:rPr>
+              <w:t xml:space="preserve"> </w:t>
+            </w:r>
+          </w:p>
+        </w:tc>
+        <w:tc>
+          <w:tcPr>
+            <w:tcW w:w="8357" w:type="dxa"/>
+            <w:gridSpan w:val="3"/>
+          </w:tcPr>
+          <w:p>
+            <w:pPr>
+              <w:spacing w:after="0" w:line="240" w:lineRule="auto"/>
+              <w:jc w:val="center"/>
               <w:rPr>
                 <w:rFonts w:asciiTheme="majorHAnsi" w:hAnsiTheme="majorHAnsi"/>
-                <w:sz w:val="32"/>
-                <w:szCs w:val="32"/>
-                <w:rtl/>
-              </w:rPr>
-              <w:t>إسم المشروع</w:t>
-            </w:r>
-            <w:r>
-              <w:rPr>
-                <w:rFonts w:asciiTheme="majorHAnsi" w:hAnsiTheme="majorHAnsi" w:hint="cs"/>
-                <w:sz w:val="32"/>
-                <w:szCs w:val="32"/>
-                <w:rtl/>
-              </w:rPr>
-              <w:t>:</w:t>
-            </w:r>
-            <w:r>
+                <w:b/>
+                <w:bCs/>
+                <w:sz w:val="32"/>
+                <w:szCs w:val="32"/>
+              </w:rPr>
+            </w:pPr>
+            <w:r>
+              <w:rPr>
+                <w:rFonts w:asciiTheme="majorHAnsi" w:eastAsia="Calibri" w:hAnsiTheme="majorHAnsi"/>
+                <w:b/>
+                <w:bCs/>
+                <w:sz w:val="32"/>
+                <w:szCs w:val="32"/>
+                <w:rtl/>
+              </w:rPr>
+              <w:t>محطة كهرباء أبيدوس</w:t>
+            </w:r>
+            <w:r>
+              <w:rPr>
+                <w:rFonts w:asciiTheme="majorHAnsi" w:eastAsia="Calibri" w:hAnsiTheme="majorHAnsi" w:cs="Arial"/>
+                <w:b/>
+                <w:bCs/>
+                <w:sz w:val="32"/>
+                <w:szCs w:val="32"/>
+              </w:rPr>
+              <w:t>2</w:t>
+            </w:r>
+            <w:r>
+              <w:rPr>
+                <w:rFonts w:asciiTheme="majorHAnsi" w:eastAsia="Calibri" w:hAnsiTheme="majorHAnsi" w:cs="Arial"/>
+                <w:b/>
+                <w:bCs/>
+                <w:sz w:val="32"/>
+                <w:szCs w:val="32"/>
+                <w:rtl/>
+              </w:rPr>
+              <w:t xml:space="preserve"> </w:t>
+            </w:r>
+            <w:r>
+              <w:rPr>
+                <w:rFonts w:asciiTheme="majorHAnsi" w:eastAsia="Calibri" w:hAnsiTheme="majorHAnsi"/>
+                <w:b/>
+                <w:bCs/>
+                <w:sz w:val="32"/>
+                <w:szCs w:val="32"/>
+                <w:rtl/>
+              </w:rPr>
+              <w:t xml:space="preserve">للطاقة الشمسية بقدرة </w:t>
+            </w:r>
+            <w:r>
+              <w:rPr>
+                <w:rFonts w:asciiTheme="majorHAnsi" w:eastAsia="Calibri" w:hAnsiTheme="majorHAnsi" w:cs="Arial"/>
+                <w:b/>
+                <w:bCs/>
+                <w:sz w:val="32"/>
+                <w:szCs w:val="32"/>
+              </w:rPr>
+              <w:t>1000</w:t>
+            </w:r>
+            <w:r>
+              <w:rPr>
+                <w:rFonts w:asciiTheme="majorHAnsi" w:eastAsia="Calibri" w:hAnsiTheme="majorHAnsi" w:cs="Arial"/>
+                <w:b/>
+                <w:bCs/>
+                <w:sz w:val="32"/>
+                <w:szCs w:val="32"/>
+                <w:rtl/>
+              </w:rPr>
+              <w:t xml:space="preserve"> </w:t>
+            </w:r>
+            <w:r>
+              <w:rPr>
+                <w:rFonts w:asciiTheme="majorHAnsi" w:eastAsia="Calibri" w:hAnsiTheme="majorHAnsi"/>
+                <w:b/>
+                <w:bCs/>
+                <w:sz w:val="32"/>
+                <w:szCs w:val="32"/>
+                <w:rtl/>
+              </w:rPr>
+              <w:t>ميجاوات</w:t>
+            </w:r>
+          </w:p>
+          <w:p>
+            <w:pPr>
+              <w:spacing w:after="0" w:line="240" w:lineRule="auto"/>
+              <w:jc w:val="center"/>
               <w:rPr>
                 <w:rFonts w:asciiTheme="majorHAnsi" w:hAnsiTheme="majorHAnsi"/>
                 <w:sz w:val="32"/>
                 <w:szCs w:val="32"/>
                 <w:lang w:bidi="ar-EG"/>
               </w:rPr>
+            </w:pPr>
+            <w:r>
+              <w:rPr>
+                <w:rFonts w:asciiTheme="majorHAnsi" w:eastAsia="Calibri" w:hAnsiTheme="majorHAnsi" w:cs="Arial"/>
+                <w:b/>
+                <w:bCs/>
+                <w:sz w:val="32"/>
+                <w:szCs w:val="32"/>
+                <w:rtl/>
+              </w:rPr>
               <w:t xml:space="preserve"> </w:t>
             </w:r>
-          </w:p>
-        </w:tc>
-        <w:tc>
-          <w:tcPr>
-            <w:tcW w:w="8233" w:type="dxa"/>
-            <w:gridSpan w:val="3"/>
-          </w:tcPr>
-          <w:p>
-            <w:pPr>
-              <w:jc w:val="center"/>
-              <w:rPr>
-                <w:rFonts w:asciiTheme="majorHAnsi" w:hAnsiTheme="majorHAnsi"/>
-                <w:b/>
-                <w:bCs/>
-                <w:sz w:val="32"/>
-                <w:szCs w:val="32"/>
-                <w:rtl/>
-              </w:rPr>
-            </w:pPr>
-            <w:r>
-              <w:rPr>
-                <w:rFonts w:asciiTheme="majorHAnsi" w:hAnsiTheme="majorHAnsi"/>
-                <w:b/>
-                <w:bCs/>
-                <w:sz w:val="32"/>
-                <w:szCs w:val="32"/>
-                <w:rtl/>
-              </w:rPr>
-              <w:t>محطة كهرباء أبيدوس2 للطاقة الشمسية بقدرة 1000 ميجاوات</w:t>
-            </w:r>
-          </w:p>
-          <w:p>
-            <w:pPr>
-              <w:jc w:val="center"/>
-              <w:rPr>
-                <w:rFonts w:asciiTheme="majorHAnsi" w:hAnsiTheme="majorHAnsi"/>
-                <w:sz w:val="32"/>
-                <w:szCs w:val="32"/>
-                <w:lang w:bidi="ar-EG"/>
-              </w:rPr>
-            </w:pPr>
-            <w:r>
-              <w:rPr>
-                <w:rFonts w:asciiTheme="majorHAnsi" w:hAnsiTheme="majorHAnsi"/>
-                <w:b/>
-                <w:bCs/>
-                <w:sz w:val="32"/>
-                <w:szCs w:val="32"/>
-                <w:rtl/>
-              </w:rPr>
-              <w:t xml:space="preserve"> </w:t>
-            </w:r>
-            <w:r>
-              <w:rPr>
-                <w:rFonts w:asciiTheme="majorHAnsi" w:hAnsiTheme="majorHAnsi"/>
+            <w:r>
+              <w:rPr>
+                <w:rFonts w:asciiTheme="majorHAnsi" w:eastAsia="Calibri" w:hAnsiTheme="majorHAnsi" w:cs="Arial"/>
                 <w:b/>
                 <w:bCs/>
                 <w:sz w:val="32"/>
@@ -198,96 +258,130 @@
         </w:trPr>
         <w:tc>
           <w:tcPr>
-            <w:tcW w:w="3557" w:type="dxa"/>
+            <w:tcW w:w="3433" w:type="dxa"/>
             <w:shd w:val="clear" w:color="auto" w:fill="C6D9F1" w:themeFill="text2" w:themeFillTint="33"/>
           </w:tcPr>
           <w:p>
             <w:pPr>
+              <w:spacing w:after="0" w:line="240" w:lineRule="auto"/>
               <w:rPr>
                 <w:rFonts w:asciiTheme="majorHAnsi" w:hAnsiTheme="majorHAnsi"/>
                 <w:sz w:val="32"/>
                 <w:szCs w:val="32"/>
-                <w:rtl/>
                 <w:lang w:bidi="ar-EG"/>
               </w:rPr>
             </w:pPr>
-            <w:r>
+            <w:proofErr w:type="spellStart"/>
+            <w:r>
+              <w:rPr>
+                <w:rFonts w:asciiTheme="majorHAnsi" w:eastAsia="Calibri" w:hAnsiTheme="majorHAnsi"/>
+                <w:sz w:val="32"/>
+                <w:szCs w:val="32"/>
+                <w:rtl/>
+              </w:rPr>
+              <w:t>إسم</w:t>
+            </w:r>
+            <w:proofErr w:type="spellEnd"/>
+            <w:r>
+              <w:rPr>
+                <w:rFonts w:asciiTheme="majorHAnsi" w:eastAsia="Calibri" w:hAnsiTheme="majorHAnsi"/>
+                <w:sz w:val="32"/>
+                <w:szCs w:val="32"/>
+                <w:rtl/>
+              </w:rPr>
+              <w:t xml:space="preserve"> الشركة</w:t>
+            </w:r>
+            <w:r>
+              <w:rPr>
+                <w:rFonts w:asciiTheme="majorHAnsi" w:eastAsia="Calibri" w:hAnsiTheme="majorHAnsi" w:cs="Arial" w:hint="cs"/>
+                <w:sz w:val="32"/>
+                <w:szCs w:val="32"/>
+                <w:rtl/>
+              </w:rPr>
+              <w:t>:</w:t>
+            </w:r>
+            <w:r>
+              <w:rPr>
+                <w:rFonts w:asciiTheme="majorHAnsi" w:eastAsia="Calibri" w:hAnsiTheme="majorHAnsi" w:cs="Arial"/>
+                <w:sz w:val="32"/>
+                <w:szCs w:val="32"/>
+                <w:rtl/>
+                <w:lang w:bidi="ar-EG"/>
+              </w:rPr>
+              <w:t xml:space="preserve"> </w:t>
+            </w:r>
+          </w:p>
+        </w:tc>
+        <w:tc>
+          <w:tcPr>
+            <w:tcW w:w="8357" w:type="dxa"/>
+            <w:gridSpan w:val="3"/>
+          </w:tcPr>
+          <w:p>
+            <w:pPr>
+              <w:spacing w:after="0" w:line="240" w:lineRule="auto"/>
               <w:rPr>
                 <w:rFonts w:asciiTheme="majorHAnsi" w:hAnsiTheme="majorHAnsi"/>
-                <w:sz w:val="32"/>
-                <w:szCs w:val="32"/>
-                <w:rtl/>
-              </w:rPr>
-              <w:t>إسم الشركة</w:t>
-            </w:r>
-            <w:r>
-              <w:rPr>
-                <w:rFonts w:asciiTheme="majorHAnsi" w:hAnsiTheme="majorHAnsi" w:hint="cs"/>
-                <w:sz w:val="32"/>
-                <w:szCs w:val="32"/>
-                <w:rtl/>
-              </w:rPr>
-              <w:t>:</w:t>
-            </w:r>
-            <w:r>
-              <w:rPr>
-                <w:rFonts w:asciiTheme="majorHAnsi" w:hAnsiTheme="majorHAnsi"/>
+                <w:b/>
+                <w:bCs/>
+                <w:sz w:val="32"/>
+                <w:szCs w:val="32"/>
+              </w:rPr>
+            </w:pPr>
+            <w:r>
+              <w:rPr>
+                <w:rFonts w:asciiTheme="majorHAnsi" w:eastAsia="Calibri" w:hAnsiTheme="majorHAnsi"/>
+                <w:b/>
+                <w:bCs/>
+                <w:sz w:val="32"/>
+                <w:szCs w:val="32"/>
+                <w:rtl/>
+              </w:rPr>
+              <w:t>تحالف الشيماء الزراعية للمقاولات والتوريدات</w:t>
+            </w:r>
+            <w:r>
+              <w:rPr>
+                <w:rFonts w:asciiTheme="majorHAnsi" w:eastAsia="Calibri" w:hAnsiTheme="majorHAnsi" w:cs="Arial"/>
+                <w:b/>
+                <w:bCs/>
+                <w:sz w:val="32"/>
+                <w:szCs w:val="32"/>
+                <w:rtl/>
+              </w:rPr>
+              <w:t>+</w:t>
+            </w:r>
+            <w:r>
+              <w:rPr>
+                <w:rFonts w:asciiTheme="majorHAnsi" w:eastAsia="Calibri" w:hAnsiTheme="majorHAnsi" w:cs="Arial"/>
+                <w:b/>
+                <w:bCs/>
                 <w:sz w:val="32"/>
                 <w:szCs w:val="32"/>
                 <w:lang w:bidi="ar-EG"/>
               </w:rPr>
+              <w:t>FM</w:t>
+            </w:r>
+            <w:r>
+              <w:rPr>
+                <w:rFonts w:asciiTheme="majorHAnsi" w:eastAsia="Calibri" w:hAnsiTheme="majorHAnsi" w:cs="Arial"/>
+                <w:b/>
+                <w:bCs/>
+                <w:sz w:val="32"/>
+                <w:szCs w:val="32"/>
+                <w:rtl/>
+              </w:rPr>
               <w:t xml:space="preserve"> </w:t>
             </w:r>
-          </w:p>
-        </w:tc>
-        <w:tc>
-          <w:tcPr>
-            <w:tcW w:w="8233" w:type="dxa"/>
-            <w:gridSpan w:val="3"/>
-          </w:tcPr>
-          <w:p>
-            <w:pPr>
-              <w:rPr>
-                <w:rFonts w:asciiTheme="majorHAnsi" w:hAnsiTheme="majorHAnsi"/>
-                <w:b/>
-                <w:bCs/>
-                <w:sz w:val="32"/>
-                <w:szCs w:val="32"/>
-                <w:rtl/>
-              </w:rPr>
-            </w:pPr>
-            <w:r>
-              <w:rPr>
-                <w:rFonts w:asciiTheme="majorHAnsi" w:hAnsiTheme="majorHAnsi"/>
-                <w:b/>
-                <w:bCs/>
-                <w:sz w:val="32"/>
-                <w:szCs w:val="32"/>
-                <w:rtl/>
-              </w:rPr>
-              <w:t>تحالف الشيماء الزراعية للمقاولات والتوريدات+</w:t>
-            </w:r>
-            <w:r>
-              <w:rPr>
-                <w:rFonts w:asciiTheme="majorHAnsi" w:hAnsiTheme="majorHAnsi"/>
-                <w:b/>
-                <w:bCs/>
-                <w:sz w:val="32"/>
-                <w:szCs w:val="32"/>
-                <w:lang w:bidi="ar-EG"/>
-              </w:rPr>
-              <w:t>FM</w:t>
-            </w:r>
-            <w:r>
-              <w:rPr>
-                <w:rFonts w:asciiTheme="majorHAnsi" w:hAnsiTheme="majorHAnsi"/>
-                <w:b/>
-                <w:bCs/>
-                <w:sz w:val="32"/>
-                <w:szCs w:val="32"/>
-                <w:rtl/>
-              </w:rPr>
-              <w:t xml:space="preserve"> للمقاولات </w:t>
+            <w:r>
+              <w:rPr>
+                <w:rFonts w:asciiTheme="majorHAnsi" w:eastAsia="Calibri" w:hAnsiTheme="majorHAnsi"/>
+                <w:b/>
+                <w:bCs/>
+                <w:sz w:val="32"/>
+                <w:szCs w:val="32"/>
+                <w:rtl/>
+              </w:rPr>
+              <w:t xml:space="preserve">للمقاولات </w:t>
             </w:r>
           </w:p>
         </w:tc>
@@ -298,108 +392,186 @@
         </w:trPr>
         <w:tc>
           <w:tcPr>
-            <w:tcW w:w="3557" w:type="dxa"/>
+            <w:tcW w:w="3433" w:type="dxa"/>
             <w:shd w:val="clear" w:color="auto" w:fill="C6D9F1" w:themeFill="text2" w:themeFillTint="33"/>
           </w:tcPr>
           <w:p>
             <w:pPr>
+              <w:spacing w:after="0" w:line="240" w:lineRule="auto"/>
               <w:rPr>
                 <w:rFonts w:asciiTheme="majorHAnsi" w:hAnsiTheme="majorHAnsi"/>
                 <w:sz w:val="32"/>
                 <w:szCs w:val="32"/>
-                <w:rtl/>
                 <w:lang w:bidi="ar-EG"/>
               </w:rPr>
             </w:pPr>
-            <w:r>
+            <w:proofErr w:type="spellStart"/>
+            <w:r>
+              <w:rPr>
+                <w:rFonts w:asciiTheme="majorHAnsi" w:eastAsia="Calibri" w:hAnsiTheme="majorHAnsi"/>
+                <w:sz w:val="32"/>
+                <w:szCs w:val="32"/>
+                <w:rtl/>
+              </w:rPr>
+              <w:t>إسم</w:t>
+            </w:r>
+            <w:proofErr w:type="spellEnd"/>
+            <w:r>
+              <w:rPr>
+                <w:rFonts w:asciiTheme="majorHAnsi" w:eastAsia="Calibri" w:hAnsiTheme="majorHAnsi"/>
+                <w:sz w:val="32"/>
+                <w:szCs w:val="32"/>
+                <w:rtl/>
+              </w:rPr>
+              <w:t xml:space="preserve"> </w:t>
+            </w:r>
+            <w:r>
+              <w:rPr>
+                <w:rFonts w:asciiTheme="majorHAnsi" w:eastAsia="Calibri" w:hAnsiTheme="majorHAnsi" w:hint="cs"/>
+                <w:sz w:val="32"/>
+                <w:szCs w:val="32"/>
+                <w:rtl/>
+              </w:rPr>
+              <w:t>السائق</w:t>
+            </w:r>
+            <w:r>
+              <w:rPr>
+                <w:rFonts w:asciiTheme="majorHAnsi" w:eastAsia="Calibri" w:hAnsiTheme="majorHAnsi" w:cs="Arial" w:hint="cs"/>
+                <w:sz w:val="32"/>
+                <w:szCs w:val="32"/>
+                <w:rtl/>
+              </w:rPr>
+              <w:t>:</w:t>
+            </w:r>
+            <w:r>
+              <w:rPr>
+                <w:rFonts w:asciiTheme="majorHAnsi" w:eastAsia="Calibri" w:hAnsiTheme="majorHAnsi" w:cs="Arial"/>
+                <w:sz w:val="32"/>
+                <w:szCs w:val="32"/>
+                <w:rtl/>
+              </w:rPr>
+              <w:t xml:space="preserve">  </w:t>
+            </w:r>
+          </w:p>
+        </w:tc>
+        <w:tc>
+          <w:tcPr>
+            <w:tcW w:w="3126" w:type="dxa"/>
+          </w:tcPr>
+          <w:p>
+            <w:pPr>
+              <w:spacing w:after="0" w:line="240" w:lineRule="auto"/>
+              <w:jc w:val="center"/>
               <w:rPr>
                 <w:rFonts w:asciiTheme="majorHAnsi" w:hAnsiTheme="majorHAnsi"/>
-                <w:sz w:val="32"/>
-                <w:szCs w:val="32"/>
-                <w:rtl/>
-              </w:rPr>
-              <w:t xml:space="preserve">إسم </w:t>
-            </w:r>
-            <w:r>
-              <w:rPr>
-                <w:rFonts w:asciiTheme="majorHAnsi" w:hAnsiTheme="majorHAnsi" w:hint="cs"/>
-                <w:sz w:val="32"/>
-                <w:szCs w:val="32"/>
-                <w:rtl/>
-              </w:rPr>
-              <w:t>السائق:</w:t>
-            </w:r>
-            <w:r>
-              <w:rPr>
-                <w:rFonts w:asciiTheme="majorHAnsi" w:hAnsiTheme="majorHAnsi"/>
-                <w:sz w:val="32"/>
-                <w:szCs w:val="32"/>
-                <w:rtl/>
-              </w:rPr>
-              <w:t xml:space="preserve">  </w:t>
-            </w:r>
-          </w:p>
-        </w:tc>
-        <w:tc>
-          <w:tcPr>
-            <w:tcW w:w="2909" w:type="dxa"/>
-          </w:tcPr>
-          <w:p>
-            <w:pPr>
-              <w:jc w:val="center"/>
-              <w:rPr>
-                <w:rFonts w:asciiTheme="majorHAnsi" w:hAnsiTheme="majorHAnsi"/>
-                <w:b/>
-                <w:bCs/>
-                <w:sz w:val="32"/>
-                <w:szCs w:val="32"/>
-                <w:rtl/>
-              </w:rPr>
-            </w:pPr>
-            <w:r>
-              <w:rPr>
-                <w:rFonts w:asciiTheme="majorHAnsi" w:eastAsia="Calibri" w:hAnsiTheme="majorHAnsi"/>
+                <w:b/>
+                <w:bCs/>
+                <w:sz w:val="32"/>
+                <w:szCs w:val="32"/>
+              </w:rPr>
+            </w:pPr>
+            <w:r>
+              <w:rPr>
+                <w:rFonts w:asciiTheme="majorHAnsi" w:eastAsia="Calibri" w:hAnsiTheme="majorHAnsi" w:cs="Arial"/>
+                <w:b/>
+                <w:bCs/>
+                <w:sz w:val="24"/>
+                <w:szCs w:val="24"/>
+                <w:rtl/>
+                <w:lang w:bidi="ar-EG"/>
+              </w:rPr>
+              <w:t>${</w:t>
+            </w:r>
+            <w:proofErr w:type="spellStart"/>
+            <w:r>
+              <w:rPr>
+                <w:rFonts w:asciiTheme="majorHAnsi" w:eastAsia="Calibri" w:hAnsiTheme="majorHAnsi" w:cs="Arial"/>
                 <w:b/>
                 <w:bCs/>
                 <w:sz w:val="24"/>
                 <w:szCs w:val="24"/>
                 <w:lang w:bidi="ar-EG"/>
               </w:rPr>
-              <w:t>${worker_name}</w:t>
-            </w:r>
-          </w:p>
-        </w:tc>
-        <w:tc>
-          <w:tcPr>
-            <w:tcW w:w="2332" w:type="dxa"/>
+              <w:t>worker_name</w:t>
+            </w:r>
+            <w:proofErr w:type="spellEnd"/>
+            <w:r>
+              <w:rPr>
+                <w:rFonts w:asciiTheme="majorHAnsi" w:eastAsia="Calibri" w:hAnsiTheme="majorHAnsi" w:cs="Arial"/>
+                <w:b/>
+                <w:bCs/>
+                <w:sz w:val="24"/>
+                <w:szCs w:val="24"/>
+                <w:rtl/>
+                <w:lang w:bidi="ar-EG"/>
+              </w:rPr>
+              <w:t>}</w:t>
+            </w:r>
+          </w:p>
+        </w:tc>
+        <w:tc>
+          <w:tcPr>
+            <w:tcW w:w="2255" w:type="dxa"/>
             <w:shd w:val="clear" w:color="auto" w:fill="C6D9F1" w:themeFill="text2" w:themeFillTint="33"/>
           </w:tcPr>
           <w:p>
             <w:pPr>
+              <w:spacing w:after="0" w:line="240" w:lineRule="auto"/>
               <w:rPr>
                 <w:rFonts w:asciiTheme="majorHAnsi" w:hAnsiTheme="majorHAnsi"/>
                 <w:sz w:val="28"/>
                 <w:szCs w:val="28"/>
-                <w:rtl/>
-              </w:rPr>
-            </w:pPr>
-            <w:r>
-              <w:rPr>
-                <w:rFonts w:asciiTheme="majorHAnsi" w:hAnsiTheme="majorHAnsi" w:hint="cs"/>
+              </w:rPr>
+            </w:pPr>
+            <w:r>
+              <w:rPr>
+                <w:rFonts w:asciiTheme="majorHAnsi" w:eastAsia="Calibri" w:hAnsiTheme="majorHAnsi" w:hint="cs"/>
                 <w:sz w:val="28"/>
                 <w:szCs w:val="28"/>
                 <w:rtl/>
               </w:rPr>
-              <w:t>وقت الشيفت :</w:t>
-            </w:r>
-          </w:p>
-        </w:tc>
-        <w:tc>
-          <w:tcPr>
-            <w:tcW w:w="2992" w:type="dxa"/>
-          </w:tcPr>
-          <w:p>
-            <w:pPr>
+              <w:t xml:space="preserve">وقت </w:t>
+            </w:r>
+            <w:proofErr w:type="spellStart"/>
+            <w:proofErr w:type="gramStart"/>
+            <w:r>
+              <w:rPr>
+                <w:rFonts w:asciiTheme="majorHAnsi" w:eastAsia="Calibri" w:hAnsiTheme="majorHAnsi" w:hint="cs"/>
+                <w:sz w:val="28"/>
+                <w:szCs w:val="28"/>
+                <w:rtl/>
+              </w:rPr>
+              <w:t>الشيفت</w:t>
+            </w:r>
+            <w:proofErr w:type="spellEnd"/>
+            <w:r>
+              <w:rPr>
+                <w:rFonts w:asciiTheme="majorHAnsi" w:eastAsia="Calibri" w:hAnsiTheme="majorHAnsi" w:hint="cs"/>
+                <w:sz w:val="28"/>
+                <w:szCs w:val="28"/>
+                <w:rtl/>
+              </w:rPr>
+              <w:t xml:space="preserve"> </w:t>
+            </w:r>
+            <w:r>
+              <w:rPr>
+                <w:rFonts w:asciiTheme="majorHAnsi" w:eastAsia="Calibri" w:hAnsiTheme="majorHAnsi" w:cs="Arial" w:hint="cs"/>
+                <w:sz w:val="28"/>
+                <w:szCs w:val="28"/>
+                <w:rtl/>
+              </w:rPr>
+              <w:t>:</w:t>
+            </w:r>
+            <w:proofErr w:type="gramEnd"/>
+          </w:p>
+        </w:tc>
+        <w:tc>
+          <w:tcPr>
+            <w:tcW w:w="2976" w:type="dxa"/>
+          </w:tcPr>
+          <w:p>
+            <w:pPr>
+              <w:spacing w:after="0" w:line="240" w:lineRule="auto"/>
               <w:jc w:val="center"/>
               <w:rPr>
                 <w:rFonts w:asciiTheme="majorHAnsi" w:hAnsiTheme="majorHAnsi"/>
@@ -407,18 +579,39 @@
                 <w:bCs/>
                 <w:sz w:val="32"/>
                 <w:szCs w:val="32"/>
-                <w:rtl/>
-              </w:rPr>
-            </w:pPr>
-            <w:r>
-              <w:rPr>
-                <w:rFonts w:asciiTheme="majorHAnsi" w:hAnsiTheme="majorHAnsi"/>
-                <w:b/>
-                <w:bCs/>
-                <w:sz w:val="32"/>
-                <w:szCs w:val="32"/>
-              </w:rPr>
-              <w:t>${shift}</w:t>
+              </w:rPr>
+            </w:pPr>
+            <w:r>
+              <w:rPr>
+                <w:rFonts w:asciiTheme="majorHAnsi" w:eastAsia="Calibri" w:hAnsiTheme="majorHAnsi" w:cs="Arial"/>
+                <w:b/>
+                <w:bCs/>
+                <w:sz w:val="32"/>
+                <w:szCs w:val="32"/>
+                <w:rtl/>
+              </w:rPr>
+              <w:t>${</w:t>
+            </w:r>
+            <w:r>
+              <w:rPr>
+                <w:rFonts w:asciiTheme="majorHAnsi" w:eastAsia="Calibri" w:hAnsiTheme="majorHAnsi" w:cs="Arial"/>
+                <w:b/>
+                <w:bCs/>
+                <w:sz w:val="32"/>
+                <w:szCs w:val="32"/>
+              </w:rPr>
+              <w:t>shift</w:t>
+            </w:r>
+            <w:r>
+              <w:rPr>
+                <w:rFonts w:asciiTheme="majorHAnsi" w:eastAsia="Calibri" w:hAnsiTheme="majorHAnsi" w:cs="Arial"/>
+                <w:b/>
+                <w:bCs/>
+                <w:sz w:val="32"/>
+                <w:szCs w:val="32"/>
+                <w:rtl/>
+              </w:rPr>
+              <w:t>}</w:t>
             </w:r>
           </w:p>
         </w:tc>
@@ -429,7 +622,7 @@
         </w:trPr>
         <w:tc>
           <w:tcPr>
-            <w:tcW w:w="3557" w:type="dxa"/>
+            <w:tcW w:w="3433" w:type="dxa"/>
             <w:shd w:val="clear" w:color="auto" w:fill="C6D9F1" w:themeFill="text2" w:themeFillTint="33"/>
           </w:tcPr>
           <w:p>
@@ -437,26 +630,28 @@
               <w:tabs>
                 <w:tab w:val="right" w:pos="2632"/>
               </w:tabs>
+              <w:spacing w:after="0" w:line="240" w:lineRule="auto"/>
               <w:rPr>
                 <w:rFonts w:asciiTheme="majorHAnsi" w:hAnsiTheme="majorHAnsi"/>
                 <w:sz w:val="32"/>
                 <w:szCs w:val="32"/>
-                <w:rtl/>
                 <w:lang w:bidi="ar-EG"/>
               </w:rPr>
             </w:pPr>
-            <w:r>
-              <w:rPr>
-                <w:rFonts w:asciiTheme="majorHAnsi" w:hAnsiTheme="majorHAnsi" w:hint="cs"/>
+            <w:proofErr w:type="gramStart"/>
+            <w:r>
+              <w:rPr>
+                <w:rFonts w:asciiTheme="majorHAnsi" w:eastAsia="Calibri" w:hAnsiTheme="majorHAnsi" w:hint="cs"/>
                 <w:sz w:val="32"/>
                 <w:szCs w:val="32"/>
                 <w:rtl/>
               </w:rPr>
               <w:t>موديل</w:t>
             </w:r>
-            <w:r>
-              <w:rPr>
-                <w:rFonts w:asciiTheme="majorHAnsi" w:hAnsiTheme="majorHAnsi"/>
+            <w:proofErr w:type="gramEnd"/>
+            <w:r>
+              <w:rPr>
+                <w:rFonts w:asciiTheme="majorHAnsi" w:eastAsia="Calibri" w:hAnsiTheme="majorHAnsi"/>
                 <w:sz w:val="32"/>
                 <w:szCs w:val="32"/>
                 <w:rtl/>
@@ -465,16 +660,25 @@
             </w:r>
             <w:r>
               <w:rPr>
-                <w:rFonts w:asciiTheme="majorHAnsi" w:hAnsiTheme="majorHAnsi" w:hint="cs"/>
-                <w:sz w:val="32"/>
-                <w:szCs w:val="32"/>
-                <w:rtl/>
-              </w:rPr>
-              <w:t>المعدة:</w:t>
-            </w:r>
-            <w:r>
-              <w:rPr>
-                <w:rFonts w:asciiTheme="majorHAnsi" w:hAnsiTheme="majorHAnsi"/>
+                <w:rFonts w:asciiTheme="majorHAnsi" w:eastAsia="Calibri" w:hAnsiTheme="majorHAnsi" w:hint="cs"/>
+                <w:sz w:val="32"/>
+                <w:szCs w:val="32"/>
+                <w:rtl/>
+              </w:rPr>
+              <w:t>المعدة</w:t>
+            </w:r>
+            <w:r>
+              <w:rPr>
+                <w:rFonts w:asciiTheme="majorHAnsi" w:eastAsia="Calibri" w:hAnsiTheme="majorHAnsi" w:cs="Arial" w:hint="cs"/>
+                <w:sz w:val="32"/>
+                <w:szCs w:val="32"/>
+                <w:rtl/>
+              </w:rPr>
+              <w:t>:</w:t>
+            </w:r>
+            <w:r>
+              <w:rPr>
+                <w:rFonts w:asciiTheme="majorHAnsi" w:eastAsia="Calibri" w:hAnsiTheme="majorHAnsi" w:cs="Arial"/>
                 <w:sz w:val="32"/>
                 <w:szCs w:val="32"/>
                 <w:rtl/>
@@ -485,10 +689,11 @@
         </w:tc>
         <w:tc>
           <w:tcPr>
-            <w:tcW w:w="2909" w:type="dxa"/>
-          </w:tcPr>
-          <w:p>
-            <w:pPr>
+            <w:tcW w:w="3126" w:type="dxa"/>
+          </w:tcPr>
+          <w:p>
+            <w:pPr>
+              <w:spacing w:after="0" w:line="240" w:lineRule="auto"/>
               <w:jc w:val="center"/>
               <w:rPr>
                 <w:rFonts w:asciiTheme="majorHAnsi" w:hAnsiTheme="majorHAnsi"/>
@@ -496,7 +701,6 @@
                 <w:bCs/>
                 <w:sz w:val="24"/>
                 <w:szCs w:val="24"/>
-                <w:rtl/>
               </w:rPr>
             </w:pPr>
             <w:r>
@@ -506,9 +710,11 @@
                 <w:bCs/>
                 <w:sz w:val="28"/>
                 <w:szCs w:val="28"/>
+                <w:rtl/>
               </w:rPr>
               <w:t>${</w:t>
             </w:r>
+            <w:proofErr w:type="spellStart"/>
             <w:r>
               <w:rPr>
                 <w:rFonts w:asciiTheme="majorHAnsi" w:eastAsia="Calibri" w:hAnsiTheme="majorHAnsi" w:cs="Arial"/>
@@ -517,8 +723,9 @@
                 <w:sz w:val="28"/>
                 <w:szCs w:val="28"/>
               </w:rPr>
-              <w:t>equipment</w:t>
-            </w:r>
+              <w:t>equipment_model</w:t>
+            </w:r>
+            <w:proofErr w:type="spellEnd"/>
             <w:r>
               <w:rPr>
                 <w:rFonts w:asciiTheme="majorHAnsi" w:eastAsia="Calibri" w:hAnsiTheme="majorHAnsi" w:cs="Arial"/>
@@ -526,82 +733,86 @@
                 <w:bCs/>
                 <w:sz w:val="28"/>
                 <w:szCs w:val="28"/>
-              </w:rPr>
-              <w:t>_</w:t>
-            </w:r>
-            <w:r>
-              <w:rPr>
-                <w:rFonts w:asciiTheme="majorHAnsi" w:eastAsia="Calibri" w:hAnsiTheme="majorHAnsi" w:cs="Arial"/>
-                <w:b/>
-                <w:bCs/>
+                <w:rtl/>
+              </w:rPr>
+              <w:t>}</w:t>
+            </w:r>
+          </w:p>
+        </w:tc>
+        <w:tc>
+          <w:tcPr>
+            <w:tcW w:w="2255" w:type="dxa"/>
+            <w:shd w:val="clear" w:color="auto" w:fill="C6D9F1" w:themeFill="text2" w:themeFillTint="33"/>
+          </w:tcPr>
+          <w:p>
+            <w:pPr>
+              <w:spacing w:after="0" w:line="240" w:lineRule="auto"/>
+              <w:rPr>
+                <w:rFonts w:asciiTheme="majorHAnsi" w:hAnsiTheme="majorHAnsi"/>
+                <w:sz w:val="32"/>
+                <w:szCs w:val="32"/>
+                <w:lang w:bidi="ar-EG"/>
+              </w:rPr>
+            </w:pPr>
+            <w:r>
+              <w:rPr>
+                <w:rFonts w:asciiTheme="majorHAnsi" w:eastAsia="Calibri" w:hAnsiTheme="majorHAnsi" w:hint="cs"/>
                 <w:sz w:val="28"/>
                 <w:szCs w:val="28"/>
-              </w:rPr>
-              <w:t>model</w:t>
-            </w:r>
-            <w:r>
-              <w:rPr>
-                <w:rFonts w:asciiTheme="majorHAnsi" w:eastAsia="Calibri" w:hAnsiTheme="majorHAnsi" w:cs="Arial"/>
-                <w:b/>
-                <w:bCs/>
+                <w:rtl/>
+              </w:rPr>
+              <w:t>نوع المعدة</w:t>
+            </w:r>
+            <w:r>
+              <w:rPr>
+                <w:rFonts w:asciiTheme="majorHAnsi" w:eastAsia="Calibri" w:hAnsiTheme="majorHAnsi" w:cs="Arial" w:hint="cs"/>
                 <w:sz w:val="28"/>
                 <w:szCs w:val="28"/>
-              </w:rPr>
-              <w:t>}</w:t>
-            </w:r>
-          </w:p>
-        </w:tc>
-        <w:tc>
-          <w:tcPr>
-            <w:tcW w:w="2332" w:type="dxa"/>
-            <w:shd w:val="clear" w:color="auto" w:fill="C6D9F1" w:themeFill="text2" w:themeFillTint="33"/>
-          </w:tcPr>
-          <w:p>
-            <w:pPr>
+                <w:rtl/>
+              </w:rPr>
+              <w:t xml:space="preserve">: </w:t>
+            </w:r>
+          </w:p>
+        </w:tc>
+        <w:tc>
+          <w:tcPr>
+            <w:tcW w:w="2976" w:type="dxa"/>
+          </w:tcPr>
+          <w:p>
+            <w:pPr>
+              <w:spacing w:after="0" w:line="240" w:lineRule="auto"/>
+              <w:jc w:val="center"/>
               <w:rPr>
                 <w:rFonts w:asciiTheme="majorHAnsi" w:hAnsiTheme="majorHAnsi"/>
-                <w:sz w:val="32"/>
-                <w:szCs w:val="32"/>
-                <w:rtl/>
-                <w:lang w:bidi="ar-EG"/>
-              </w:rPr>
-            </w:pPr>
-            <w:r>
-              <w:rPr>
-                <w:rFonts w:asciiTheme="majorHAnsi" w:hAnsiTheme="majorHAnsi" w:hint="cs"/>
+                <w:b/>
+                <w:bCs/>
+                <w:sz w:val="32"/>
+                <w:szCs w:val="32"/>
+              </w:rPr>
+            </w:pPr>
+            <w:r>
+              <w:rPr>
+                <w:rFonts w:asciiTheme="majorHAnsi" w:eastAsia="Calibri" w:hAnsiTheme="majorHAnsi" w:cs="Arial"/>
+                <w:b/>
+                <w:bCs/>
                 <w:sz w:val="28"/>
                 <w:szCs w:val="28"/>
                 <w:rtl/>
               </w:rPr>
-              <w:t>نوع المعدة:</w:t>
-            </w:r>
-            <w:r>
-              <w:rPr>
-                <w:rFonts w:asciiTheme="majorHAnsi" w:hAnsiTheme="majorHAnsi" w:hint="cs"/>
+              <w:t>${</w:t>
+            </w:r>
+            <w:proofErr w:type="spellStart"/>
+            <w:r>
+              <w:rPr>
+                <w:rFonts w:asciiTheme="majorHAnsi" w:eastAsia="Calibri" w:hAnsiTheme="majorHAnsi" w:cs="Arial"/>
+                <w:b/>
+                <w:bCs/>
                 <w:sz w:val="28"/>
                 <w:szCs w:val="28"/>
-                <w:rtl/>
-              </w:rPr>
-              <w:t xml:space="preserve"> </w:t>
-            </w:r>
-          </w:p>
-        </w:tc>
-        <w:tc>
-          <w:tcPr>
-            <w:tcW w:w="2992" w:type="dxa"/>
-          </w:tcPr>
-          <w:p>
-            <w:pPr>
-              <w:jc w:val="center"/>
-              <w:rPr>
-                <w:rFonts w:asciiTheme="majorHAnsi" w:hAnsiTheme="majorHAnsi"/>
-                <w:b/>
-                <w:bCs/>
-                <w:sz w:val="32"/>
-                <w:szCs w:val="32"/>
-                <w:rtl/>
-              </w:rPr>
-            </w:pPr>
+              </w:rPr>
+              <w:t>equipment_type</w:t>
+            </w:r>
+            <w:proofErr w:type="spellEnd"/>
             <w:r>
               <w:rPr>
                 <w:rFonts w:asciiTheme="majorHAnsi" w:eastAsia="Calibri" w:hAnsiTheme="majorHAnsi" w:cs="Arial"/>
@@ -609,26 +820,7 @@
                 <w:bCs/>
                 <w:sz w:val="28"/>
                 <w:szCs w:val="28"/>
-              </w:rPr>
-              <w:t>${</w:t>
-            </w:r>
-            <w:r>
-              <w:rPr>
-                <w:rFonts w:asciiTheme="majorHAnsi" w:eastAsia="Calibri" w:hAnsiTheme="majorHAnsi" w:cs="Arial"/>
-                <w:b/>
-                <w:bCs/>
-                <w:sz w:val="28"/>
-                <w:szCs w:val="28"/>
-              </w:rPr>
-              <w:t>equipment_type</w:t>
-            </w:r>
-            <w:r>
-              <w:rPr>
-                <w:rFonts w:asciiTheme="majorHAnsi" w:eastAsia="Calibri" w:hAnsiTheme="majorHAnsi" w:cs="Arial"/>
-                <w:b/>
-                <w:bCs/>
-                <w:sz w:val="28"/>
-                <w:szCs w:val="28"/>
+                <w:rtl/>
               </w:rPr>
               <w:t>}</w:t>
             </w:r>
@@ -641,22 +833,22 @@
         </w:trPr>
         <w:tc>
           <w:tcPr>
-            <w:tcW w:w="3557" w:type="dxa"/>
+            <w:tcW w:w="3433" w:type="dxa"/>
             <w:shd w:val="clear" w:color="auto" w:fill="C6D9F1" w:themeFill="text2" w:themeFillTint="33"/>
           </w:tcPr>
           <w:p>
             <w:pPr>
+              <w:spacing w:after="0" w:line="240" w:lineRule="auto"/>
               <w:rPr>
                 <w:rFonts w:asciiTheme="majorHAnsi" w:hAnsiTheme="majorHAnsi"/>
                 <w:sz w:val="32"/>
                 <w:szCs w:val="32"/>
-                <w:rtl/>
                 <w:lang w:bidi="ar-EG"/>
               </w:rPr>
             </w:pPr>
             <w:r>
               <w:rPr>
-                <w:rFonts w:asciiTheme="majorHAnsi" w:hAnsiTheme="majorHAnsi" w:hint="cs"/>
+                <w:rFonts w:asciiTheme="majorHAnsi" w:eastAsia="Calibri" w:hAnsiTheme="majorHAnsi" w:hint="cs"/>
                 <w:sz w:val="32"/>
                 <w:szCs w:val="32"/>
                 <w:rtl/>
@@ -665,47 +857,56 @@
             </w:r>
             <w:r>
               <w:rPr>
+                <w:rFonts w:asciiTheme="majorHAnsi" w:eastAsia="Calibri" w:hAnsiTheme="majorHAnsi"/>
+                <w:sz w:val="32"/>
+                <w:szCs w:val="32"/>
+                <w:rtl/>
+              </w:rPr>
+              <w:t xml:space="preserve"> </w:t>
+            </w:r>
+            <w:r>
+              <w:rPr>
+                <w:rFonts w:asciiTheme="majorHAnsi" w:eastAsia="Calibri" w:hAnsiTheme="majorHAnsi" w:hint="cs"/>
+                <w:sz w:val="32"/>
+                <w:szCs w:val="32"/>
+                <w:rtl/>
+              </w:rPr>
+              <w:t>شاسيه المعدة</w:t>
+            </w:r>
+            <w:r>
+              <w:rPr>
+                <w:rFonts w:asciiTheme="majorHAnsi" w:eastAsia="Calibri" w:hAnsiTheme="majorHAnsi" w:cs="Arial" w:hint="cs"/>
+                <w:sz w:val="32"/>
+                <w:szCs w:val="32"/>
+                <w:rtl/>
+              </w:rPr>
+              <w:t>:</w:t>
+            </w:r>
+            <w:r>
+              <w:rPr>
+                <w:rFonts w:asciiTheme="majorHAnsi" w:eastAsia="Calibri" w:hAnsiTheme="majorHAnsi" w:cs="Arial"/>
+                <w:sz w:val="32"/>
+                <w:szCs w:val="32"/>
+                <w:rtl/>
+              </w:rPr>
+              <w:t xml:space="preserve"> </w:t>
+            </w:r>
+          </w:p>
+        </w:tc>
+        <w:tc>
+          <w:tcPr>
+            <w:tcW w:w="3126" w:type="dxa"/>
+          </w:tcPr>
+          <w:p>
+            <w:pPr>
+              <w:spacing w:after="0" w:line="240" w:lineRule="auto"/>
+              <w:jc w:val="center"/>
+              <w:rPr>
                 <w:rFonts w:asciiTheme="majorHAnsi" w:hAnsiTheme="majorHAnsi"/>
-                <w:sz w:val="32"/>
-                <w:szCs w:val="32"/>
-                <w:rtl/>
-              </w:rPr>
-              <w:t xml:space="preserve"> </w:t>
-            </w:r>
-            <w:r>
-              <w:rPr>
-                <w:rFonts w:asciiTheme="majorHAnsi" w:hAnsiTheme="majorHAnsi" w:hint="cs"/>
-                <w:sz w:val="32"/>
-                <w:szCs w:val="32"/>
-                <w:rtl/>
-              </w:rPr>
-              <w:t>شاسيه المعدة:</w:t>
-            </w:r>
-            <w:r>
-              <w:rPr>
-                <w:rFonts w:asciiTheme="majorHAnsi" w:hAnsiTheme="majorHAnsi"/>
-                <w:sz w:val="32"/>
-                <w:szCs w:val="32"/>
-                <w:rtl/>
-              </w:rPr>
-              <w:t xml:space="preserve"> </w:t>
-            </w:r>
-          </w:p>
-        </w:tc>
-        <w:tc>
-          <w:tcPr>
-            <w:tcW w:w="2909" w:type="dxa"/>
-          </w:tcPr>
-          <w:p>
-            <w:pPr>
-              <w:jc w:val="center"/>
-              <w:rPr>
-                <w:rFonts w:asciiTheme="majorHAnsi" w:hAnsiTheme="majorHAnsi"/>
-                <w:b/>
-                <w:bCs/>
-                <w:sz w:val="32"/>
-                <w:szCs w:val="32"/>
-                <w:rtl/>
+                <w:b/>
+                <w:bCs/>
+                <w:sz w:val="32"/>
+                <w:szCs w:val="32"/>
               </w:rPr>
             </w:pPr>
             <w:r>
@@ -715,9 +916,11 @@
                 <w:bCs/>
                 <w:sz w:val="28"/>
                 <w:szCs w:val="28"/>
+                <w:rtl/>
               </w:rPr>
               <w:t>${</w:t>
             </w:r>
+            <w:proofErr w:type="spellStart"/>
             <w:r>
               <w:rPr>
                 <w:rFonts w:asciiTheme="majorHAnsi" w:eastAsia="Calibri" w:hAnsiTheme="majorHAnsi" w:cs="Arial"/>
@@ -728,6 +931,7 @@
               </w:rPr>
               <w:t>equipment_number</w:t>
             </w:r>
+            <w:proofErr w:type="spellEnd"/>
             <w:r>
               <w:rPr>
                 <w:rFonts w:asciiTheme="majorHAnsi" w:eastAsia="Calibri" w:hAnsiTheme="majorHAnsi" w:cs="Arial"/>
@@ -735,6 +939,7 @@
                 <w:bCs/>
                 <w:sz w:val="28"/>
                 <w:szCs w:val="28"/>
+                <w:rtl/>
               </w:rPr>
               <w:t>}</w:t>
             </w:r>
@@ -742,36 +947,46 @@
         </w:tc>
         <w:tc>
           <w:tcPr>
-            <w:tcW w:w="2332" w:type="dxa"/>
+            <w:tcW w:w="2255" w:type="dxa"/>
             <w:shd w:val="clear" w:color="auto" w:fill="C6D9F1" w:themeFill="text2" w:themeFillTint="33"/>
           </w:tcPr>
           <w:p>
             <w:pPr>
+              <w:spacing w:after="0" w:line="240" w:lineRule="auto"/>
               <w:rPr>
                 <w:rFonts w:asciiTheme="majorHAnsi" w:hAnsiTheme="majorHAnsi"/>
                 <w:sz w:val="32"/>
                 <w:szCs w:val="32"/>
-                <w:rtl/>
                 <w:lang w:bidi="ar-EG"/>
               </w:rPr>
             </w:pPr>
             <w:r>
               <w:rPr>
-                <w:rFonts w:asciiTheme="majorHAnsi" w:hAnsiTheme="majorHAnsi" w:hint="cs"/>
-                <w:sz w:val="32"/>
-                <w:szCs w:val="32"/>
-                <w:rtl/>
-              </w:rPr>
-              <w:t xml:space="preserve">كود المعدة: </w:t>
-            </w:r>
-          </w:p>
-        </w:tc>
-        <w:tc>
-          <w:tcPr>
-            <w:tcW w:w="2992" w:type="dxa"/>
-          </w:tcPr>
-          <w:p>
-            <w:pPr>
+                <w:rFonts w:asciiTheme="majorHAnsi" w:eastAsia="Calibri" w:hAnsiTheme="majorHAnsi" w:hint="cs"/>
+                <w:sz w:val="32"/>
+                <w:szCs w:val="32"/>
+                <w:rtl/>
+              </w:rPr>
+              <w:t>كود المعدة</w:t>
+            </w:r>
+            <w:r>
+              <w:rPr>
+                <w:rFonts w:asciiTheme="majorHAnsi" w:eastAsia="Calibri" w:hAnsiTheme="majorHAnsi" w:cs="Arial" w:hint="cs"/>
+                <w:sz w:val="32"/>
+                <w:szCs w:val="32"/>
+                <w:rtl/>
+              </w:rPr>
+              <w:t xml:space="preserve">: </w:t>
+            </w:r>
+          </w:p>
+        </w:tc>
+        <w:tc>
+          <w:tcPr>
+            <w:tcW w:w="2976" w:type="dxa"/>
+          </w:tcPr>
+          <w:p>
+            <w:pPr>
+              <w:spacing w:after="0" w:line="240" w:lineRule="auto"/>
               <w:jc w:val="center"/>
               <w:rPr>
                 <w:rFonts w:asciiTheme="majorHAnsi" w:hAnsiTheme="majorHAnsi"/>
@@ -789,9 +1004,11 @@
                 <w:bCs/>
                 <w:sz w:val="28"/>
                 <w:szCs w:val="28"/>
+                <w:rtl/>
               </w:rPr>
               <w:t>${</w:t>
             </w:r>
+            <w:proofErr w:type="spellStart"/>
             <w:r>
               <w:rPr>
                 <w:rFonts w:asciiTheme="majorHAnsi" w:eastAsia="Calibri" w:hAnsiTheme="majorHAnsi" w:cs="Arial"/>
@@ -802,6 +1019,7 @@
               </w:rPr>
               <w:t>equipment_code</w:t>
             </w:r>
+            <w:proofErr w:type="spellEnd"/>
             <w:r>
               <w:rPr>
                 <w:rFonts w:asciiTheme="majorHAnsi" w:eastAsia="Calibri" w:hAnsiTheme="majorHAnsi" w:cs="Arial"/>
@@ -809,6 +1027,7 @@
                 <w:bCs/>
                 <w:sz w:val="28"/>
                 <w:szCs w:val="28"/>
+                <w:rtl/>
               </w:rPr>
               <w:t>}</w:t>
             </w:r>
@@ -816,13 +1035,7 @@
         </w:tc>
       </w:tr>
     </w:tbl>
-    <w:p>
-      <w:pPr>
-        <w:rPr>
-          <w:rtl/>
-        </w:rPr>
-      </w:pPr>
-    </w:p>
+    <w:p/>
     <w:tbl>
       <w:tblPr>
         <w:tblStyle w:val="TableGrid"/>
@@ -833,15 +1046,15 @@
         <w:tblLook w:val="04A0" w:firstRow="1" w:lastRow="0" w:firstColumn="1" w:lastColumn="0" w:noHBand="0" w:noVBand="1"/>
       </w:tblPr>
       <w:tblGrid>
-        <w:gridCol w:w="830"/>
+        <w:gridCol w:w="829"/>
         <w:gridCol w:w="1500"/>
-        <w:gridCol w:w="993"/>
+        <w:gridCol w:w="994"/>
         <w:gridCol w:w="1081"/>
         <w:gridCol w:w="1263"/>
         <w:gridCol w:w="1083"/>
         <w:gridCol w:w="1112"/>
-        <w:gridCol w:w="1211"/>
-        <w:gridCol w:w="1231"/>
+        <w:gridCol w:w="1210"/>
+        <w:gridCol w:w="1232"/>
         <w:gridCol w:w="1304"/>
       </w:tblGrid>
       <w:tr>
@@ -851,11 +1064,12 @@
         </w:trPr>
         <w:tc>
           <w:tcPr>
-            <w:tcW w:w="830" w:type="dxa"/>
+            <w:tcW w:w="829" w:type="dxa"/>
             <w:shd w:val="clear" w:color="auto" w:fill="B8CCE4" w:themeFill="accent1" w:themeFillTint="66"/>
           </w:tcPr>
           <w:p>
             <w:pPr>
+              <w:spacing w:after="0" w:line="240" w:lineRule="auto"/>
               <w:jc w:val="center"/>
               <w:rPr>
                 <w:b/>
@@ -880,6 +1094,7 @@
           </w:tcPr>
           <w:p>
             <w:pPr>
+              <w:spacing w:after="0" w:line="240" w:lineRule="auto"/>
               <w:jc w:val="center"/>
               <w:rPr>
                 <w:b/>
@@ -899,17 +1114,17 @@
         </w:tc>
         <w:tc>
           <w:tcPr>
-            <w:tcW w:w="993" w:type="dxa"/>
+            <w:tcW w:w="994" w:type="dxa"/>
             <w:shd w:val="clear" w:color="auto" w:fill="B8CCE4" w:themeFill="accent1" w:themeFillTint="66"/>
           </w:tcPr>
           <w:p>
             <w:pPr>
+              <w:spacing w:after="0" w:line="240" w:lineRule="auto"/>
               <w:jc w:val="center"/>
               <w:rPr>
                 <w:rFonts w:ascii="Calibri" w:eastAsia="Calibri" w:hAnsi="Calibri"/>
                 <w:b/>
                 <w:bCs/>
-                <w:rtl/>
               </w:rPr>
             </w:pPr>
             <w:r>
@@ -924,6 +1139,7 @@
           </w:p>
           <w:p>
             <w:pPr>
+              <w:spacing w:after="0" w:line="240" w:lineRule="auto"/>
               <w:jc w:val="center"/>
               <w:rPr>
                 <w:b/>
@@ -948,12 +1164,12 @@
           </w:tcPr>
           <w:p>
             <w:pPr>
+              <w:spacing w:after="0" w:line="240" w:lineRule="auto"/>
               <w:jc w:val="center"/>
               <w:rPr>
                 <w:rFonts w:ascii="Calibri" w:eastAsia="Calibri" w:hAnsi="Calibri"/>
                 <w:b/>
                 <w:bCs/>
-                <w:rtl/>
               </w:rPr>
             </w:pPr>
             <w:r>
@@ -968,6 +1184,7 @@
           </w:p>
           <w:p>
             <w:pPr>
+              <w:spacing w:after="0" w:line="240" w:lineRule="auto"/>
               <w:jc w:val="center"/>
               <w:rPr>
                 <w:b/>
@@ -992,12 +1209,12 @@
           </w:tcPr>
           <w:p>
             <w:pPr>
+              <w:spacing w:after="0" w:line="240" w:lineRule="auto"/>
               <w:jc w:val="center"/>
               <w:rPr>
                 <w:rFonts w:ascii="Calibri" w:eastAsia="Calibri" w:hAnsi="Calibri"/>
                 <w:b/>
                 <w:bCs/>
-                <w:rtl/>
               </w:rPr>
             </w:pPr>
             <w:r>
@@ -1012,6 +1229,7 @@
           </w:p>
           <w:p>
             <w:pPr>
+              <w:spacing w:after="0" w:line="240" w:lineRule="auto"/>
               <w:jc w:val="center"/>
               <w:rPr>
                 <w:b/>
@@ -1036,6 +1254,7 @@
           </w:tcPr>
           <w:p>
             <w:pPr>
+              <w:spacing w:after="0" w:line="240" w:lineRule="auto"/>
               <w:jc w:val="center"/>
               <w:rPr>
                 <w:b/>
@@ -1060,12 +1279,12 @@
           </w:tcPr>
           <w:p>
             <w:pPr>
+              <w:spacing w:after="0" w:line="240" w:lineRule="auto"/>
               <w:jc w:val="center"/>
               <w:rPr>
                 <w:rFonts w:ascii="Calibri" w:eastAsia="Calibri" w:hAnsi="Calibri"/>
                 <w:b/>
                 <w:bCs/>
-                <w:rtl/>
               </w:rPr>
             </w:pPr>
             <w:r>
@@ -1080,6 +1299,7 @@
           </w:p>
           <w:p>
             <w:pPr>
+              <w:spacing w:after="0" w:line="240" w:lineRule="auto"/>
               <w:jc w:val="center"/>
               <w:rPr>
                 <w:b/>
@@ -1099,11 +1319,12 @@
         </w:tc>
         <w:tc>
           <w:tcPr>
-            <w:tcW w:w="1211" w:type="dxa"/>
+            <w:tcW w:w="1210" w:type="dxa"/>
             <w:shd w:val="clear" w:color="auto" w:fill="B8CCE4" w:themeFill="accent1" w:themeFillTint="66"/>
           </w:tcPr>
           <w:p>
             <w:pPr>
+              <w:spacing w:after="0" w:line="240" w:lineRule="auto"/>
               <w:jc w:val="center"/>
               <w:rPr>
                 <w:b/>
@@ -1123,11 +1344,12 @@
         </w:tc>
         <w:tc>
           <w:tcPr>
-            <w:tcW w:w="1231" w:type="dxa"/>
+            <w:tcW w:w="1232" w:type="dxa"/>
             <w:shd w:val="clear" w:color="auto" w:fill="B8CCE4" w:themeFill="accent1" w:themeFillTint="66"/>
           </w:tcPr>
           <w:p>
             <w:pPr>
+              <w:spacing w:after="0" w:line="240" w:lineRule="auto"/>
               <w:jc w:val="center"/>
               <w:rPr>
                 <w:b/>
@@ -1152,6 +1374,7 @@
           </w:tcPr>
           <w:p>
             <w:pPr>
+              <w:spacing w:after="0" w:line="240" w:lineRule="auto"/>
               <w:jc w:val="center"/>
               <w:rPr>
                 <w:b/>
@@ -1177,10 +1400,11 @@
         </w:trPr>
         <w:tc>
           <w:tcPr>
-            <w:tcW w:w="830" w:type="dxa"/>
-          </w:tcPr>
-          <w:p>
-            <w:pPr>
+            <w:tcW w:w="829" w:type="dxa"/>
+          </w:tcPr>
+          <w:p>
+            <w:pPr>
+              <w:spacing w:after="0" w:line="240" w:lineRule="auto"/>
               <w:jc w:val="center"/>
               <w:rPr>
                 <w:b/>
@@ -1196,6 +1420,7 @@
               </w:rPr>
               <w:t>${</w:t>
             </w:r>
+            <w:proofErr w:type="spellStart"/>
             <w:r>
               <w:rPr>
                 <w:rFonts w:eastAsia="Calibri" w:cs="Arial"/>
@@ -1204,6 +1429,7 @@
               </w:rPr>
               <w:t>row_serial</w:t>
             </w:r>
+            <w:proofErr w:type="spellEnd"/>
             <w:r>
               <w:rPr>
                 <w:rFonts w:eastAsia="Calibri" w:cs="Arial"/>
@@ -1221,6 +1447,7 @@
           </w:tcPr>
           <w:p>
             <w:pPr>
+              <w:spacing w:after="0" w:line="240" w:lineRule="auto"/>
               <w:jc w:val="center"/>
               <w:rPr>
                 <w:b/>
@@ -1236,6 +1463,7 @@
               </w:rPr>
               <w:t>${</w:t>
             </w:r>
+            <w:proofErr w:type="spellStart"/>
             <w:r>
               <w:rPr>
                 <w:rFonts w:eastAsia="Calibri" w:cs="Arial"/>
@@ -1244,6 +1472,7 @@
               </w:rPr>
               <w:t>row_date</w:t>
             </w:r>
+            <w:proofErr w:type="spellEnd"/>
             <w:r>
               <w:rPr>
                 <w:rFonts w:eastAsia="Calibri" w:cs="Arial"/>
@@ -1257,10 +1486,11 @@
         </w:tc>
         <w:tc>
           <w:tcPr>
-            <w:tcW w:w="993" w:type="dxa"/>
-          </w:tcPr>
-          <w:p>
-            <w:pPr>
+            <w:tcW w:w="994" w:type="dxa"/>
+          </w:tcPr>
+          <w:p>
+            <w:pPr>
+              <w:spacing w:after="0" w:line="240" w:lineRule="auto"/>
               <w:jc w:val="center"/>
               <w:rPr>
                 <w:b/>
@@ -1275,6 +1505,7 @@
           </w:tcPr>
           <w:p>
             <w:pPr>
+              <w:spacing w:after="0" w:line="240" w:lineRule="auto"/>
               <w:jc w:val="center"/>
               <w:rPr>
                 <w:b/>
@@ -1289,6 +1520,7 @@
           </w:tcPr>
           <w:p>
             <w:pPr>
+              <w:spacing w:after="0" w:line="240" w:lineRule="auto"/>
               <w:jc w:val="center"/>
               <w:rPr>
                 <w:b/>
@@ -1303,6 +1535,7 @@
           </w:tcPr>
           <w:p>
             <w:pPr>
+              <w:spacing w:after="0" w:line="240" w:lineRule="auto"/>
               <w:jc w:val="center"/>
               <w:rPr>
                 <w:b/>
@@ -1317,34 +1550,37 @@
           </w:tcPr>
           <w:p>
             <w:pPr>
-              <w:jc w:val="center"/>
-              <w:rPr>
-                <w:b/>
-                <w:bCs/>
-              </w:rPr>
-            </w:pPr>
-          </w:p>
-        </w:tc>
-        <w:tc>
-          <w:tcPr>
-            <w:tcW w:w="1211" w:type="dxa"/>
-          </w:tcPr>
-          <w:p>
-            <w:pPr>
-              <w:jc w:val="center"/>
-              <w:rPr>
-                <w:b/>
-                <w:bCs/>
-              </w:rPr>
-            </w:pPr>
-          </w:p>
-        </w:tc>
-        <w:tc>
-          <w:tcPr>
-            <w:tcW w:w="1231" w:type="dxa"/>
-          </w:tcPr>
-          <w:p>
-            <w:pPr>
+              <w:spacing w:after="0" w:line="240" w:lineRule="auto"/>
+              <w:jc w:val="center"/>
+              <w:rPr>
+                <w:b/>
+                <w:bCs/>
+              </w:rPr>
+            </w:pPr>
+          </w:p>
+        </w:tc>
+        <w:tc>
+          <w:tcPr>
+            <w:tcW w:w="1210" w:type="dxa"/>
+          </w:tcPr>
+          <w:p>
+            <w:pPr>
+              <w:spacing w:after="0" w:line="240" w:lineRule="auto"/>
+              <w:jc w:val="center"/>
+              <w:rPr>
+                <w:b/>
+                <w:bCs/>
+              </w:rPr>
+            </w:pPr>
+          </w:p>
+        </w:tc>
+        <w:tc>
+          <w:tcPr>
+            <w:tcW w:w="1232" w:type="dxa"/>
+          </w:tcPr>
+          <w:p>
+            <w:pPr>
+              <w:spacing w:after="0" w:line="240" w:lineRule="auto"/>
               <w:jc w:val="center"/>
               <w:rPr>
                 <w:b/>
@@ -1359,6 +1595,7 @@
           </w:tcPr>
           <w:p>
             <w:pPr>
+              <w:spacing w:after="0" w:line="240" w:lineRule="auto"/>
               <w:jc w:val="center"/>
               <w:rPr>
                 <w:b/>
@@ -1376,8 +1613,9 @@
     </w:p>
     <w:sectPr>
       <w:pgSz w:w="12240" w:h="15840"/>
-      <w:pgMar w:top="630" w:right="1440" w:bottom="540" w:left="1440" w:header="720" w:footer="720" w:gutter="0"/>
+      <w:pgMar w:top="630" w:right="1440" w:bottom="540" w:left="1440" w:header="0" w:footer="0" w:gutter="0"/>
       <w:cols w:space="720"/>
+      <w:formProt w:val="0"/>
       <w:docGrid w:linePitch="360"/>
     </w:sectPr>
   </w:body>
@@ -1397,7 +1635,7 @@
     </w:rPrDefault>
     <w:pPrDefault>
       <w:pPr>
-        <w:spacing w:after="200" w:line="276" w:lineRule="auto"/>
+        <w:suppressAutoHyphens/>
       </w:pPr>
     </w:pPrDefault>
   </w:docDefaults>
@@ -1785,6 +2023,7 @@
     <w:rsid w:val="00713D93"/>
     <w:pPr>
       <w:bidi/>
+      <w:spacing w:after="200" w:line="276" w:lineRule="auto"/>
     </w:pPr>
   </w:style>
   <w:style w:type="character" w:default="1" w:styleId="DefaultParagraphFont">
@@ -1814,14 +2053,99 @@
     <w:semiHidden/>
     <w:unhideWhenUsed/>
   </w:style>
+  <w:style w:type="character" w:customStyle="1" w:styleId="BalloonTextChar">
+    <w:name w:val="Balloon Text Char"/>
+    <w:basedOn w:val="DefaultParagraphFont"/>
+    <w:link w:val="BalloonText"/>
+    <w:uiPriority w:val="99"/>
+    <w:semiHidden/>
+    <w:qFormat/>
+    <w:rsid w:val="00713D93"/>
+    <w:rPr>
+      <w:rFonts w:ascii="Tahoma" w:hAnsi="Tahoma" w:cs="Tahoma"/>
+      <w:sz w:val="16"/>
+      <w:szCs w:val="16"/>
+    </w:rPr>
+  </w:style>
+  <w:style w:type="paragraph" w:customStyle="1" w:styleId="Heading">
+    <w:name w:val="Heading"/>
+    <w:basedOn w:val="Normal"/>
+    <w:next w:val="BodyText"/>
+    <w:qFormat/>
+    <w:pPr>
+      <w:keepNext/>
+      <w:spacing w:before="240" w:after="120"/>
+    </w:pPr>
+    <w:rPr>
+      <w:rFonts w:ascii="Liberation Sans" w:eastAsia="Microsoft YaHei" w:hAnsi="Liberation Sans" w:cs="Lucida Sans"/>
+      <w:sz w:val="28"/>
+      <w:szCs w:val="28"/>
+    </w:rPr>
+  </w:style>
+  <w:style w:type="paragraph" w:styleId="BodyText">
+    <w:name w:val="Body Text"/>
+    <w:basedOn w:val="Normal"/>
+    <w:pPr>
+      <w:spacing w:after="140"/>
+    </w:pPr>
+  </w:style>
+  <w:style w:type="paragraph" w:styleId="List">
+    <w:name w:val="List"/>
+    <w:basedOn w:val="BodyText"/>
+    <w:rPr>
+      <w:rFonts w:cs="Lucida Sans"/>
+    </w:rPr>
+  </w:style>
+  <w:style w:type="paragraph" w:styleId="Caption">
+    <w:name w:val="caption"/>
+    <w:basedOn w:val="Normal"/>
+    <w:qFormat/>
+    <w:pPr>
+      <w:suppressLineNumbers/>
+      <w:spacing w:before="120" w:after="120"/>
+    </w:pPr>
+    <w:rPr>
+      <w:rFonts w:cs="Lucida Sans"/>
+      <w:i/>
+      <w:iCs/>
+      <w:sz w:val="24"/>
+      <w:szCs w:val="24"/>
+    </w:rPr>
+  </w:style>
+  <w:style w:type="paragraph" w:customStyle="1" w:styleId="Index">
+    <w:name w:val="Index"/>
+    <w:basedOn w:val="Normal"/>
+    <w:qFormat/>
+    <w:pPr>
+      <w:suppressLineNumbers/>
+    </w:pPr>
+    <w:rPr>
+      <w:rFonts w:cs="Lucida Sans"/>
+    </w:rPr>
+  </w:style>
+  <w:style w:type="paragraph" w:styleId="BalloonText">
+    <w:name w:val="Balloon Text"/>
+    <w:basedOn w:val="Normal"/>
+    <w:link w:val="BalloonTextChar"/>
+    <w:uiPriority w:val="99"/>
+    <w:semiHidden/>
+    <w:unhideWhenUsed/>
+    <w:qFormat/>
+    <w:rsid w:val="00713D93"/>
+    <w:pPr>
+      <w:spacing w:after="0" w:line="240" w:lineRule="auto"/>
+    </w:pPr>
+    <w:rPr>
+      <w:rFonts w:ascii="Tahoma" w:hAnsi="Tahoma" w:cs="Tahoma"/>
+      <w:sz w:val="16"/>
+      <w:szCs w:val="16"/>
+    </w:rPr>
+  </w:style>
   <w:style w:type="table" w:styleId="TableGrid">
     <w:name w:val="Table Grid"/>
     <w:basedOn w:val="TableNormal"/>
     <w:uiPriority w:val="59"/>
     <w:rsid w:val="00713D93"/>
-    <w:pPr>
-      <w:spacing w:after="0" w:line="240" w:lineRule="auto"/>
-    </w:pPr>
     <w:tblPr>
       <w:tblBorders>
         <w:top w:val="single" w:sz="4" w:space="0" w:color="auto"/>
@@ -1833,36 +2157,6 @@
       </w:tblBorders>
     </w:tblPr>
   </w:style>
-  <w:style w:type="paragraph" w:styleId="BalloonText">
-    <w:name w:val="Balloon Text"/>
-    <w:basedOn w:val="Normal"/>
-    <w:link w:val="BalloonTextChar"/>
-    <w:uiPriority w:val="99"/>
-    <w:semiHidden/>
-    <w:unhideWhenUsed/>
-    <w:rsid w:val="00713D93"/>
-    <w:pPr>
-      <w:spacing w:after="0" w:line="240" w:lineRule="auto"/>
-    </w:pPr>
-    <w:rPr>
-      <w:rFonts w:ascii="Tahoma" w:hAnsi="Tahoma" w:cs="Tahoma"/>
-      <w:sz w:val="16"/>
-      <w:szCs w:val="16"/>
-    </w:rPr>
-  </w:style>
-  <w:style w:type="character" w:customStyle="1" w:styleId="BalloonTextChar">
-    <w:name w:val="Balloon Text Char"/>
-    <w:basedOn w:val="DefaultParagraphFont"/>
-    <w:link w:val="BalloonText"/>
-    <w:uiPriority w:val="99"/>
-    <w:semiHidden/>
-    <w:rsid w:val="00713D93"/>
-    <w:rPr>
-      <w:rFonts w:ascii="Tahoma" w:hAnsi="Tahoma" w:cs="Tahoma"/>
-      <w:sz w:val="16"/>
-      <w:szCs w:val="16"/>
-    </w:rPr>
-  </w:style>
 </w:styles>
 </file>
 
@@ -1871,10 +2165,10 @@
   <a:themeElements>
     <a:clrScheme name="Office">
       <a:dk1>
-        <a:sysClr val="windowText" lastClr="000000"/>
+        <a:srgbClr val="000000"/>
       </a:dk1>
       <a:lt1>
-        <a:sysClr val="window" lastClr="FFFFFF"/>
+        <a:srgbClr val="FFFFFF"/>
       </a:lt1>
       <a:dk2>
         <a:srgbClr val="1F497D"/>
@@ -1912,236 +2206,128 @@
         <a:latin typeface="Cambria"/>
         <a:ea typeface=""/>
         <a:cs typeface=""/>
-        <a:font script="Jpan" typeface="ＭＳ ゴシック"/>
-        <a:font script="Hang" typeface="맑은 고딕"/>
-        <a:font script="Hans" typeface="宋体"/>
-        <a:font script="Hant" typeface="新細明體"/>
-        <a:font script="Arab" typeface="Times New Roman"/>
-        <a:font script="Hebr" typeface="Times New Roman"/>
-        <a:font script="Thai" typeface="Angsana New"/>
-        <a:font script="Ethi" typeface="Nyala"/>
-        <a:font script="Beng" typeface="Vrinda"/>
-        <a:font script="Gujr" typeface="Shruti"/>
-        <a:font script="Khmr" typeface="MoolBoran"/>
-        <a:font script="Knda" typeface="Tunga"/>
-        <a:font script="Guru" typeface="Raavi"/>
-        <a:font script="Cans" typeface="Euphemia"/>
-        <a:font script="Cher" typeface="Plantagenet Cherokee"/>
-        <a:font script="Yiii" typeface="Microsoft Yi Baiti"/>
-        <a:font script="Tibt" typeface="Microsoft Himalaya"/>
-        <a:font script="Thaa" typeface="MV Boli"/>
-        <a:font script="Deva" typeface="Mangal"/>
-        <a:font script="Telu" typeface="Gautami"/>
-        <a:font script="Taml" typeface="Latha"/>
-        <a:font script="Syrc" typeface="Estrangelo Edessa"/>
-        <a:font script="Orya" typeface="Kalinga"/>
-        <a:font script="Mlym" typeface="Kartika"/>
-        <a:font script="Laoo" typeface="DokChampa"/>
-        <a:font script="Sinh" typeface="Iskoola Pota"/>
-        <a:font script="Mong" typeface="Mongolian Baiti"/>
-        <a:font script="Viet" typeface="Times New Roman"/>
-        <a:font script="Uigh" typeface="Microsoft Uighur"/>
-        <a:font script="Geor" typeface="Sylfaen"/>
       </a:majorFont>
       <a:minorFont>
         <a:latin typeface="Calibri"/>
         <a:ea typeface=""/>
         <a:cs typeface=""/>
-        <a:font script="Jpan" typeface="ＭＳ 明朝"/>
-        <a:font script="Hang" typeface="맑은 고딕"/>
-        <a:font script="Hans" typeface="宋体"/>
-        <a:font script="Hant" typeface="新細明體"/>
-        <a:font script="Arab" typeface="Arial"/>
-        <a:font script="Hebr" typeface="Arial"/>
-        <a:font script="Thai" typeface="Cordia New"/>
-        <a:font script="Ethi" typeface="Nyala"/>
-        <a:font script="Beng" typeface="Vrinda"/>
-        <a:font script="Gujr" typeface="Shruti"/>
-        <a:font script="Khmr" typeface="DaunPenh"/>
-        <a:font script="Knda" typeface="Tunga"/>
-        <a:font script="Guru" typeface="Raavi"/>
-        <a:font script="Cans" typeface="Euphemia"/>
-        <a:font script="Cher" typeface="Plantagenet Cherokee"/>
-        <a:font script="Yiii" typeface="Microsoft Yi Baiti"/>
-        <a:font script="Tibt" typeface="Microsoft Himalaya"/>
-        <a:font script="Thaa" typeface="MV Boli"/>
-        <a:font script="Deva" typeface="Mangal"/>
-        <a:font script="Telu" typeface="Gautami"/>
-        <a:font script="Taml" typeface="Latha"/>
-        <a:font script="Syrc" typeface="Estrangelo Edessa"/>
-        <a:font script="Orya" typeface="Kalinga"/>
-        <a:font script="Mlym" typeface="Kartika"/>
-        <a:font script="Laoo" typeface="DokChampa"/>
-        <a:font script="Sinh" typeface="Iskoola Pota"/>
-        <a:font script="Mong" typeface="Mongolian Baiti"/>
-        <a:font script="Viet" typeface="Arial"/>
-        <a:font script="Uigh" typeface="Microsoft Uighur"/>
-        <a:font script="Geor" typeface="Sylfaen"/>
       </a:minorFont>
     </a:fontScheme>
-    <a:fmtScheme name="Office">
+    <a:fmtScheme>
       <a:fillStyleLst>
         <a:solidFill>
           <a:schemeClr val="phClr"/>
         </a:solidFill>
-        <a:gradFill rotWithShape="1">
+        <a:gradFill>
           <a:gsLst>
             <a:gs pos="0">
               <a:schemeClr val="phClr">
                 <a:tint val="50000"/>
-                <a:satMod val="300000"/>
               </a:schemeClr>
             </a:gs>
             <a:gs pos="35000">
               <a:schemeClr val="phClr">
                 <a:tint val="37000"/>
-                <a:satMod val="300000"/>
               </a:schemeClr>
             </a:gs>
             <a:gs pos="100000">
               <a:schemeClr val="phClr">
                 <a:tint val="15000"/>
-                <a:satMod val="350000"/>
               </a:schemeClr>
             </a:gs>
           </a:gsLst>
           <a:lin ang="16200000" scaled="1"/>
+          <a:tileRect/>
         </a:gradFill>
-        <a:gradFill rotWithShape="1">
+        <a:gradFill>
           <a:gsLst>
             <a:gs pos="0">
               <a:schemeClr val="phClr">
                 <a:shade val="51000"/>
-                <a:satMod val="130000"/>
               </a:schemeClr>
             </a:gs>
             <a:gs pos="80000">
               <a:schemeClr val="phClr">
                 <a:shade val="93000"/>
-                <a:satMod val="130000"/>
               </a:schemeClr>
             </a:gs>
             <a:gs pos="100000">
               <a:schemeClr val="phClr">
                 <a:shade val="94000"/>
-                <a:satMod val="135000"/>
               </a:schemeClr>
             </a:gs>
           </a:gsLst>
           <a:lin ang="16200000" scaled="0"/>
+          <a:tileRect/>
         </a:gradFill>
       </a:fillStyleLst>
       <a:lnStyleLst>
         <a:ln w="9525" cap="flat" cmpd="sng" algn="ctr">
-          <a:solidFill>
-            <a:schemeClr val="phClr">
-              <a:shade val="95000"/>
-              <a:satMod val="105000"/>
-            </a:schemeClr>
-          </a:solidFill>
           <a:prstDash val="solid"/>
         </a:ln>
         <a:ln w="25400" cap="flat" cmpd="sng" algn="ctr">
-          <a:solidFill>
-            <a:schemeClr val="phClr"/>
-          </a:solidFill>
           <a:prstDash val="solid"/>
         </a:ln>
         <a:ln w="38100" cap="flat" cmpd="sng" algn="ctr">
-          <a:solidFill>
-            <a:schemeClr val="phClr"/>
-          </a:solidFill>
           <a:prstDash val="solid"/>
         </a:ln>
       </a:lnStyleLst>
       <a:effectStyleLst>
         <a:effectStyle>
-          <a:effectLst>
-            <a:outerShdw blurRad="40000" dist="20000" dir="5400000" rotWithShape="0">
-              <a:srgbClr val="000000">
-                <a:alpha val="38000"/>
-              </a:srgbClr>
-            </a:outerShdw>
-          </a:effectLst>
+          <a:effectLst/>
         </a:effectStyle>
         <a:effectStyle>
-          <a:effectLst>
-            <a:outerShdw blurRad="40000" dist="23000" dir="5400000" rotWithShape="0">
-              <a:srgbClr val="000000">
-                <a:alpha val="35000"/>
-              </a:srgbClr>
-            </a:outerShdw>
-          </a:effectLst>
+          <a:effectLst/>
         </a:effectStyle>
         <a:effectStyle>
-          <a:effectLst>
-            <a:outerShdw blurRad="40000" dist="23000" dir="5400000" rotWithShape="0">
-              <a:srgbClr val="000000">
-                <a:alpha val="35000"/>
-              </a:srgbClr>
-            </a:outerShdw>
-          </a:effectLst>
-          <a:scene3d>
-            <a:camera prst="orthographicFront">
-              <a:rot lat="0" lon="0" rev="0"/>
-            </a:camera>
-            <a:lightRig rig="threePt" dir="t">
-              <a:rot lat="0" lon="0" rev="1200000"/>
-            </a:lightRig>
-          </a:scene3d>
-          <a:sp3d>
-            <a:bevelT w="63500" h="25400"/>
-          </a:sp3d>
+          <a:effectLst/>
         </a:effectStyle>
       </a:effectStyleLst>
       <a:bgFillStyleLst>
         <a:solidFill>
           <a:schemeClr val="phClr"/>
         </a:solidFill>
-        <a:gradFill rotWithShape="1">
+        <a:gradFill>
           <a:gsLst>
             <a:gs pos="0">
               <a:schemeClr val="phClr">
                 <a:tint val="40000"/>
-                <a:satMod val="350000"/>
               </a:schemeClr>
             </a:gs>
             <a:gs pos="40000">
               <a:schemeClr val="phClr">
                 <a:tint val="45000"/>
                 <a:shade val="99000"/>
-                <a:satMod val="350000"/>
               </a:schemeClr>
             </a:gs>
             <a:gs pos="100000">
               <a:schemeClr val="phClr">
                 <a:shade val="20000"/>
-                <a:satMod val="255000"/>
               </a:schemeClr>
             </a:gs>
           </a:gsLst>
           <a:path path="circle">
             <a:fillToRect l="50000" t="-80000" r="50000" b="180000"/>
           </a:path>
+          <a:tileRect/>
         </a:gradFill>
-        <a:gradFill rotWithShape="1">
+        <a:gradFill>
           <a:gsLst>
             <a:gs pos="0">
               <a:schemeClr val="phClr">
                 <a:tint val="80000"/>
-                <a:satMod val="300000"/>
               </a:schemeClr>
             </a:gs>
             <a:gs pos="100000">
               <a:schemeClr val="phClr">
                 <a:shade val="30000"/>
-                <a:satMod val="200000"/>
               </a:schemeClr>
             </a:gs>
           </a:gsLst>
           <a:path path="circle">
             <a:fillToRect l="50000" t="50000" r="50000" b="50000"/>
           </a:path>
+          <a:tileRect/>
         </a:gradFill>
       </a:bgFillStyleLst>
     </a:fmtScheme>

</xml_diff>